<commit_message>
Motor v3.3: doble via (deep research + scraping) como fase obligatoria
Adenda que codifica el cambio v3.1 -> v3.3: la investigacion por doble via +
contraste deja de ser opcional y pasa a fase nucleo obligatoria del motor, para
todo elemento y todo producto. Regla soberana: donde B (VoC) contradice A (deep
research), manda B. Spine reconciliado al final. Caso de referencia: proyecto higado.

Co-Authored-By: Claude Opus 4.8 <noreply@anthropic.com>
</commit_message>
<xml_diff>
--- a/v3.1/DOC 21b — Banco de Hooks v3.2.docx
+++ b/v3.1/DOC 21b — Banco de Hooks v3.2.docx
@@ -4,10 +4,88 @@
   <w:body>
     <w:p>
       <w:pPr>
-        <w:pStyle w:val="Title"/>
+        <w:pStyle w:val="Heading1"/>
       </w:pPr>
       <w:r>
         <w:t>DOC 21b — Banco de Hooks v3.2 (alineado al Spine post-contraste)</w:t>
+      </w:r>
+    </w:p>
+    <w:p>
+      <w:pPr>
+        <w:pStyle w:val="Heading3"/>
+      </w:pPr>
+      <w:r>
+        <w:t>Cold traffic Meta/TikTok · Español México · Suplemento hepático+intestinal en gotas</w:t>
+      </w:r>
+    </w:p>
+    <w:p>
+      <w:pPr>
+        <w:ind w:left="432"/>
+      </w:pPr>
+      <w:r>
+        <w:rPr>
+          <w:b/>
+          <w:i/>
+        </w:rPr>
+        <w:t>Supera al DOC 21 (v3), que abría por hinchazón estética.</w:t>
+      </w:r>
+      <w:r>
+        <w:rPr>
+          <w:i/>
+        </w:rPr>
+        <w:t xml:space="preserve"> Estos hooks abren por el </w:t>
+      </w:r>
+      <w:r>
+        <w:rPr>
+          <w:b/>
+          <w:i/>
+        </w:rPr>
+        <w:t>terror del diagnóstico de hígado graso</w:t>
+      </w:r>
+      <w:r>
+        <w:rPr>
+          <w:i/>
+        </w:rPr>
+        <w:t xml:space="preserve"> + </w:t>
+      </w:r>
+      <w:r>
+        <w:rPr>
+          <w:b/>
+          <w:i/>
+        </w:rPr>
+        <w:t>revertir sin cirugía</w:t>
+      </w:r>
+      <w:r>
+        <w:rPr>
+          <w:i/>
+        </w:rPr>
+        <w:t xml:space="preserve">, tono de fe/esperanza, objeción de </w:t>
+      </w:r>
+      <w:r>
+        <w:rPr>
+          <w:b/>
+          <w:i/>
+        </w:rPr>
+        <w:t>seguridad</w:t>
+      </w:r>
+      <w:r>
+        <w:rPr>
+          <w:i/>
+        </w:rPr>
+        <w:t xml:space="preserve"> (no precio). Cada hook lleva su </w:t>
+      </w:r>
+      <w:r>
+        <w:rPr>
+          <w:b/>
+          <w:i/>
+        </w:rPr>
+        <w:t>ID de cita origen</w:t>
+      </w:r>
+      <w:r>
+        <w:rPr>
+          <w:i/>
+        </w:rPr>
+        <w:t xml:space="preserve"> real, la inferencia usada, el cluster que explota, la hipótesis que testea y su prioridad de testeo.</w:t>
       </w:r>
     </w:p>
     <w:p>
@@ -15,15 +93,15 @@
         <w:rPr>
           <w:b/>
         </w:rPr>
-        <w:t xml:space="preserve">Supera al DOC 21 (v3). </w:t>
+        <w:t>Frame v3.2:</w:t>
       </w:r>
       <w:r>
-        <w:t>Abre por el terror del diagnóstico de hígado graso + revertir sin cirugía. Tono fe/esperanza. Objeción de seguridad (no precio). "Limpiar el hígado", nunca "detox".</w:t>
+        <w:t xml:space="preserve"> núcleo = madre creyente 45-65 aterrada de morir de hígado graso · gancho = diagnóstico + revertir natural sin cirugía · mecanismo = 'limpiar el hígado' (folk) + bilis/alcachofa (nunca 'detox') · prueba = ultrasonido/kilos/cifra · villano = frituras/azúcar + el DIY casero · hinchazón→hígado = testimonio, no hecho médico (riesgo compliance).</w:t>
       </w:r>
     </w:p>
     <w:p>
       <w:pPr>
-        <w:pStyle w:val="Heading1"/>
+        <w:pStyle w:val="Heading2"/>
       </w:pPr>
       <w:r>
         <w:t>Núcleo del Diagnóstico (madre creyente aterrada)</w:t>
@@ -36,19 +114,20 @@
         <w:tblLook w:firstColumn="1" w:firstRow="1" w:lastColumn="0" w:lastRow="0" w:noHBand="0" w:noVBand="1" w:val="04A0"/>
       </w:tblPr>
       <w:tblGrid>
-        <w:gridCol w:w="1080"/>
-        <w:gridCol w:w="1080"/>
-        <w:gridCol w:w="1080"/>
-        <w:gridCol w:w="1080"/>
-        <w:gridCol w:w="1080"/>
-        <w:gridCol w:w="1080"/>
-        <w:gridCol w:w="1080"/>
-        <w:gridCol w:w="1080"/>
+        <w:gridCol w:w="960"/>
+        <w:gridCol w:w="960"/>
+        <w:gridCol w:w="960"/>
+        <w:gridCol w:w="960"/>
+        <w:gridCol w:w="960"/>
+        <w:gridCol w:w="960"/>
+        <w:gridCol w:w="960"/>
+        <w:gridCol w:w="960"/>
+        <w:gridCol w:w="960"/>
       </w:tblGrid>
       <w:tr>
         <w:tc>
           <w:tcPr>
-            <w:tcW w:type="dxa" w:w="1080"/>
+            <w:tcW w:type="dxa" w:w="960"/>
           </w:tcPr>
           <w:p>
             <w:r>
@@ -61,7 +140,7 @@
         </w:tc>
         <w:tc>
           <w:tcPr>
-            <w:tcW w:type="dxa" w:w="1080"/>
+            <w:tcW w:type="dxa" w:w="960"/>
           </w:tcPr>
           <w:p>
             <w:r>
@@ -74,7 +153,7 @@
         </w:tc>
         <w:tc>
           <w:tcPr>
-            <w:tcW w:type="dxa" w:w="1080"/>
+            <w:tcW w:type="dxa" w:w="960"/>
           </w:tcPr>
           <w:p>
             <w:r>
@@ -87,7 +166,7 @@
         </w:tc>
         <w:tc>
           <w:tcPr>
-            <w:tcW w:type="dxa" w:w="1080"/>
+            <w:tcW w:type="dxa" w:w="960"/>
           </w:tcPr>
           <w:p>
             <w:r>
@@ -100,7 +179,20 @@
         </w:tc>
         <w:tc>
           <w:tcPr>
-            <w:tcW w:type="dxa" w:w="1080"/>
+            <w:tcW w:type="dxa" w:w="960"/>
+          </w:tcPr>
+          <w:p>
+            <w:r>
+              <w:rPr>
+                <w:b/>
+              </w:rPr>
+              <w:t>Cluster</w:t>
+            </w:r>
+          </w:p>
+        </w:tc>
+        <w:tc>
+          <w:tcPr>
+            <w:tcW w:type="dxa" w:w="960"/>
           </w:tcPr>
           <w:p>
             <w:r>
@@ -113,7 +205,7 @@
         </w:tc>
         <w:tc>
           <w:tcPr>
-            <w:tcW w:type="dxa" w:w="1080"/>
+            <w:tcW w:type="dxa" w:w="960"/>
           </w:tcPr>
           <w:p>
             <w:r>
@@ -126,7 +218,7 @@
         </w:tc>
         <w:tc>
           <w:tcPr>
-            <w:tcW w:type="dxa" w:w="1080"/>
+            <w:tcW w:type="dxa" w:w="960"/>
           </w:tcPr>
           <w:p>
             <w:r>
@@ -139,7 +231,7 @@
         </w:tc>
         <w:tc>
           <w:tcPr>
-            <w:tcW w:type="dxa" w:w="1080"/>
+            <w:tcW w:type="dxa" w:w="960"/>
           </w:tcPr>
           <w:p>
             <w:r>
@@ -154,7 +246,7 @@
       <w:tr>
         <w:tc>
           <w:tcPr>
-            <w:tcW w:type="dxa" w:w="1080"/>
+            <w:tcW w:type="dxa" w:w="960"/>
           </w:tcPr>
           <w:p>
             <w:r>
@@ -164,7 +256,7 @@
         </w:tc>
         <w:tc>
           <w:tcPr>
-            <w:tcW w:type="dxa" w:w="1080"/>
+            <w:tcW w:type="dxa" w:w="960"/>
           </w:tcPr>
           <w:p>
             <w:r>
@@ -174,7 +266,7 @@
         </w:tc>
         <w:tc>
           <w:tcPr>
-            <w:tcW w:type="dxa" w:w="1080"/>
+            <w:tcW w:type="dxa" w:w="960"/>
           </w:tcPr>
           <w:p>
             <w:r>
@@ -184,7 +276,7 @@
         </w:tc>
         <w:tc>
           <w:tcPr>
-            <w:tcW w:type="dxa" w:w="1080"/>
+            <w:tcW w:type="dxa" w:w="960"/>
           </w:tcPr>
           <w:p>
             <w:r>
@@ -194,17 +286,31 @@
         </w:tc>
         <w:tc>
           <w:tcPr>
-            <w:tcW w:type="dxa" w:w="1080"/>
-          </w:tcPr>
-          <w:p>
-            <w:r>
+            <w:tcW w:type="dxa" w:w="960"/>
+          </w:tcPr>
+          <w:p>
+            <w:r>
+              <w:t>Terror del diagnóstico / madre por la hija</w:t>
+            </w:r>
+          </w:p>
+        </w:tc>
+        <w:tc>
+          <w:tcPr>
+            <w:tcW w:type="dxa" w:w="960"/>
+          </w:tcPr>
+          <w:p>
+            <w:r>
+              <w:rPr>
+                <w:rFonts w:ascii="Consolas" w:hAnsi="Consolas"/>
+                <w:color w:val="C03030"/>
+              </w:rPr>
               <w:t>EV20ee996cc059</w:t>
             </w:r>
           </w:p>
         </w:tc>
         <w:tc>
           <w:tcPr>
-            <w:tcW w:type="dxa" w:w="1080"/>
+            <w:tcW w:type="dxa" w:w="960"/>
           </w:tcPr>
           <w:p>
             <w:r>
@@ -214,7 +320,7 @@
         </w:tc>
         <w:tc>
           <w:tcPr>
-            <w:tcW w:type="dxa" w:w="1080"/>
+            <w:tcW w:type="dxa" w:w="960"/>
           </w:tcPr>
           <w:p>
             <w:r>
@@ -224,7 +330,7 @@
         </w:tc>
         <w:tc>
           <w:tcPr>
-            <w:tcW w:type="dxa" w:w="1080"/>
+            <w:tcW w:type="dxa" w:w="960"/>
           </w:tcPr>
           <w:p>
             <w:r>
@@ -236,7 +342,7 @@
       <w:tr>
         <w:tc>
           <w:tcPr>
-            <w:tcW w:type="dxa" w:w="1080"/>
+            <w:tcW w:type="dxa" w:w="960"/>
           </w:tcPr>
           <w:p>
             <w:r>
@@ -246,7 +352,7 @@
         </w:tc>
         <w:tc>
           <w:tcPr>
-            <w:tcW w:type="dxa" w:w="1080"/>
+            <w:tcW w:type="dxa" w:w="960"/>
           </w:tcPr>
           <w:p>
             <w:r>
@@ -256,7 +362,7 @@
         </w:tc>
         <w:tc>
           <w:tcPr>
-            <w:tcW w:type="dxa" w:w="1080"/>
+            <w:tcW w:type="dxa" w:w="960"/>
           </w:tcPr>
           <w:p>
             <w:r>
@@ -266,7 +372,7 @@
         </w:tc>
         <w:tc>
           <w:tcPr>
-            <w:tcW w:type="dxa" w:w="1080"/>
+            <w:tcW w:type="dxa" w:w="960"/>
           </w:tcPr>
           <w:p>
             <w:r>
@@ -276,17 +382,31 @@
         </w:tc>
         <w:tc>
           <w:tcPr>
-            <w:tcW w:type="dxa" w:w="1080"/>
-          </w:tcPr>
-          <w:p>
-            <w:r>
+            <w:tcW w:type="dxa" w:w="960"/>
+          </w:tcPr>
+          <w:p>
+            <w:r>
+              <w:t>Miedo mortal / vi morir a alguien</w:t>
+            </w:r>
+          </w:p>
+        </w:tc>
+        <w:tc>
+          <w:tcPr>
+            <w:tcW w:type="dxa" w:w="960"/>
+          </w:tcPr>
+          <w:p>
+            <w:r>
+              <w:rPr>
+                <w:rFonts w:ascii="Consolas" w:hAnsi="Consolas"/>
+                <w:color w:val="C03030"/>
+              </w:rPr>
               <w:t>EV8c9dc6159962</w:t>
             </w:r>
           </w:p>
         </w:tc>
         <w:tc>
           <w:tcPr>
-            <w:tcW w:type="dxa" w:w="1080"/>
+            <w:tcW w:type="dxa" w:w="960"/>
           </w:tcPr>
           <w:p>
             <w:r>
@@ -296,7 +416,7 @@
         </w:tc>
         <w:tc>
           <w:tcPr>
-            <w:tcW w:type="dxa" w:w="1080"/>
+            <w:tcW w:type="dxa" w:w="960"/>
           </w:tcPr>
           <w:p>
             <w:r>
@@ -306,7 +426,7 @@
         </w:tc>
         <w:tc>
           <w:tcPr>
-            <w:tcW w:type="dxa" w:w="1080"/>
+            <w:tcW w:type="dxa" w:w="960"/>
           </w:tcPr>
           <w:p>
             <w:r>
@@ -318,7 +438,7 @@
       <w:tr>
         <w:tc>
           <w:tcPr>
-            <w:tcW w:type="dxa" w:w="1080"/>
+            <w:tcW w:type="dxa" w:w="960"/>
           </w:tcPr>
           <w:p>
             <w:r>
@@ -328,7 +448,7 @@
         </w:tc>
         <w:tc>
           <w:tcPr>
-            <w:tcW w:type="dxa" w:w="1080"/>
+            <w:tcW w:type="dxa" w:w="960"/>
           </w:tcPr>
           <w:p>
             <w:r>
@@ -338,7 +458,7 @@
         </w:tc>
         <w:tc>
           <w:tcPr>
-            <w:tcW w:type="dxa" w:w="1080"/>
+            <w:tcW w:type="dxa" w:w="960"/>
           </w:tcPr>
           <w:p>
             <w:r>
@@ -348,7 +468,7 @@
         </w:tc>
         <w:tc>
           <w:tcPr>
-            <w:tcW w:type="dxa" w:w="1080"/>
+            <w:tcW w:type="dxa" w:w="960"/>
           </w:tcPr>
           <w:p>
             <w:r>
@@ -358,17 +478,31 @@
         </w:tc>
         <w:tc>
           <w:tcPr>
-            <w:tcW w:type="dxa" w:w="1080"/>
-          </w:tcPr>
-          <w:p>
-            <w:r>
+            <w:tcW w:type="dxa" w:w="960"/>
+          </w:tcPr>
+          <w:p>
+            <w:r>
+              <w:t>Desesperación tras el diagnóstico</w:t>
+            </w:r>
+          </w:p>
+        </w:tc>
+        <w:tc>
+          <w:tcPr>
+            <w:tcW w:type="dxa" w:w="960"/>
+          </w:tcPr>
+          <w:p>
+            <w:r>
+              <w:rPr>
+                <w:rFonts w:ascii="Consolas" w:hAnsi="Consolas"/>
+                <w:color w:val="C03030"/>
+              </w:rPr>
               <w:t>EV20dccf8b1975</w:t>
             </w:r>
           </w:p>
         </w:tc>
         <w:tc>
           <w:tcPr>
-            <w:tcW w:type="dxa" w:w="1080"/>
+            <w:tcW w:type="dxa" w:w="960"/>
           </w:tcPr>
           <w:p>
             <w:r>
@@ -378,7 +512,7 @@
         </w:tc>
         <w:tc>
           <w:tcPr>
-            <w:tcW w:type="dxa" w:w="1080"/>
+            <w:tcW w:type="dxa" w:w="960"/>
           </w:tcPr>
           <w:p>
             <w:r>
@@ -388,7 +522,7 @@
         </w:tc>
         <w:tc>
           <w:tcPr>
-            <w:tcW w:type="dxa" w:w="1080"/>
+            <w:tcW w:type="dxa" w:w="960"/>
           </w:tcPr>
           <w:p>
             <w:r>
@@ -400,7 +534,7 @@
       <w:tr>
         <w:tc>
           <w:tcPr>
-            <w:tcW w:type="dxa" w:w="1080"/>
+            <w:tcW w:type="dxa" w:w="960"/>
           </w:tcPr>
           <w:p>
             <w:r>
@@ -410,7 +544,7 @@
         </w:tc>
         <w:tc>
           <w:tcPr>
-            <w:tcW w:type="dxa" w:w="1080"/>
+            <w:tcW w:type="dxa" w:w="960"/>
           </w:tcPr>
           <w:p>
             <w:r>
@@ -420,7 +554,7 @@
         </w:tc>
         <w:tc>
           <w:tcPr>
-            <w:tcW w:type="dxa" w:w="1080"/>
+            <w:tcW w:type="dxa" w:w="960"/>
           </w:tcPr>
           <w:p>
             <w:r>
@@ -430,7 +564,7 @@
         </w:tc>
         <w:tc>
           <w:tcPr>
-            <w:tcW w:type="dxa" w:w="1080"/>
+            <w:tcW w:type="dxa" w:w="960"/>
           </w:tcPr>
           <w:p>
             <w:r>
@@ -440,17 +574,31 @@
         </w:tc>
         <w:tc>
           <w:tcPr>
-            <w:tcW w:type="dxa" w:w="1080"/>
-          </w:tcPr>
-          <w:p>
-            <w:r>
+            <w:tcW w:type="dxa" w:w="960"/>
+          </w:tcPr>
+          <w:p>
+            <w:r>
+              <w:t>Evitar el quirófano / vía natural</w:t>
+            </w:r>
+          </w:p>
+        </w:tc>
+        <w:tc>
+          <w:tcPr>
+            <w:tcW w:type="dxa" w:w="960"/>
+          </w:tcPr>
+          <w:p>
+            <w:r>
+              <w:rPr>
+                <w:rFonts w:ascii="Consolas" w:hAnsi="Consolas"/>
+                <w:color w:val="C03030"/>
+              </w:rPr>
               <w:t>EV103445ddfd2a</w:t>
             </w:r>
           </w:p>
         </w:tc>
         <w:tc>
           <w:tcPr>
-            <w:tcW w:type="dxa" w:w="1080"/>
+            <w:tcW w:type="dxa" w:w="960"/>
           </w:tcPr>
           <w:p>
             <w:r>
@@ -460,7 +608,7 @@
         </w:tc>
         <w:tc>
           <w:tcPr>
-            <w:tcW w:type="dxa" w:w="1080"/>
+            <w:tcW w:type="dxa" w:w="960"/>
           </w:tcPr>
           <w:p>
             <w:r>
@@ -470,7 +618,7 @@
         </w:tc>
         <w:tc>
           <w:tcPr>
-            <w:tcW w:type="dxa" w:w="1080"/>
+            <w:tcW w:type="dxa" w:w="960"/>
           </w:tcPr>
           <w:p>
             <w:r>
@@ -482,7 +630,7 @@
       <w:tr>
         <w:tc>
           <w:tcPr>
-            <w:tcW w:type="dxa" w:w="1080"/>
+            <w:tcW w:type="dxa" w:w="960"/>
           </w:tcPr>
           <w:p>
             <w:r>
@@ -492,7 +640,7 @@
         </w:tc>
         <w:tc>
           <w:tcPr>
-            <w:tcW w:type="dxa" w:w="1080"/>
+            <w:tcW w:type="dxa" w:w="960"/>
           </w:tcPr>
           <w:p>
             <w:r>
@@ -502,7 +650,7 @@
         </w:tc>
         <w:tc>
           <w:tcPr>
-            <w:tcW w:type="dxa" w:w="1080"/>
+            <w:tcW w:type="dxa" w:w="960"/>
           </w:tcPr>
           <w:p>
             <w:r>
@@ -512,7 +660,7 @@
         </w:tc>
         <w:tc>
           <w:tcPr>
-            <w:tcW w:type="dxa" w:w="1080"/>
+            <w:tcW w:type="dxa" w:w="960"/>
           </w:tcPr>
           <w:p>
             <w:r>
@@ -522,17 +670,31 @@
         </w:tc>
         <w:tc>
           <w:tcPr>
-            <w:tcW w:type="dxa" w:w="1080"/>
-          </w:tcPr>
-          <w:p>
-            <w:r>
+            <w:tcW w:type="dxa" w:w="960"/>
+          </w:tcPr>
+          <w:p>
+            <w:r>
+              <w:t>Revertir natural / limpiar el hígado</w:t>
+            </w:r>
+          </w:p>
+        </w:tc>
+        <w:tc>
+          <w:tcPr>
+            <w:tcW w:type="dxa" w:w="960"/>
+          </w:tcPr>
+          <w:p>
+            <w:r>
+              <w:rPr>
+                <w:rFonts w:ascii="Consolas" w:hAnsi="Consolas"/>
+                <w:color w:val="C03030"/>
+              </w:rPr>
               <w:t>EV395aeee91c7c</w:t>
             </w:r>
           </w:p>
         </w:tc>
         <w:tc>
           <w:tcPr>
-            <w:tcW w:type="dxa" w:w="1080"/>
+            <w:tcW w:type="dxa" w:w="960"/>
           </w:tcPr>
           <w:p>
             <w:r>
@@ -542,7 +704,7 @@
         </w:tc>
         <w:tc>
           <w:tcPr>
-            <w:tcW w:type="dxa" w:w="1080"/>
+            <w:tcW w:type="dxa" w:w="960"/>
           </w:tcPr>
           <w:p>
             <w:r>
@@ -552,7 +714,7 @@
         </w:tc>
         <w:tc>
           <w:tcPr>
-            <w:tcW w:type="dxa" w:w="1080"/>
+            <w:tcW w:type="dxa" w:w="960"/>
           </w:tcPr>
           <w:p>
             <w:r>
@@ -564,7 +726,7 @@
       <w:tr>
         <w:tc>
           <w:tcPr>
-            <w:tcW w:type="dxa" w:w="1080"/>
+            <w:tcW w:type="dxa" w:w="960"/>
           </w:tcPr>
           <w:p>
             <w:r>
@@ -574,7 +736,7 @@
         </w:tc>
         <w:tc>
           <w:tcPr>
-            <w:tcW w:type="dxa" w:w="1080"/>
+            <w:tcW w:type="dxa" w:w="960"/>
           </w:tcPr>
           <w:p>
             <w:r>
@@ -584,7 +746,7 @@
         </w:tc>
         <w:tc>
           <w:tcPr>
-            <w:tcW w:type="dxa" w:w="1080"/>
+            <w:tcW w:type="dxa" w:w="960"/>
           </w:tcPr>
           <w:p>
             <w:r>
@@ -594,7 +756,7 @@
         </w:tc>
         <w:tc>
           <w:tcPr>
-            <w:tcW w:type="dxa" w:w="1080"/>
+            <w:tcW w:type="dxa" w:w="960"/>
           </w:tcPr>
           <w:p>
             <w:r>
@@ -604,17 +766,31 @@
         </w:tc>
         <w:tc>
           <w:tcPr>
-            <w:tcW w:type="dxa" w:w="1080"/>
-          </w:tcPr>
-          <w:p>
-            <w:r>
+            <w:tcW w:type="dxa" w:w="960"/>
+          </w:tcPr>
+          <w:p>
+            <w:r>
+              <w:t>Prueba medible / revirtió lo irreversible</w:t>
+            </w:r>
+          </w:p>
+        </w:tc>
+        <w:tc>
+          <w:tcPr>
+            <w:tcW w:type="dxa" w:w="960"/>
+          </w:tcPr>
+          <w:p>
+            <w:r>
+              <w:rPr>
+                <w:rFonts w:ascii="Consolas" w:hAnsi="Consolas"/>
+                <w:color w:val="C03030"/>
+              </w:rPr>
               <w:t>EV23ec746f6d9a</w:t>
             </w:r>
           </w:p>
         </w:tc>
         <w:tc>
           <w:tcPr>
-            <w:tcW w:type="dxa" w:w="1080"/>
+            <w:tcW w:type="dxa" w:w="960"/>
           </w:tcPr>
           <w:p>
             <w:r>
@@ -624,7 +800,7 @@
         </w:tc>
         <w:tc>
           <w:tcPr>
-            <w:tcW w:type="dxa" w:w="1080"/>
+            <w:tcW w:type="dxa" w:w="960"/>
           </w:tcPr>
           <w:p>
             <w:r>
@@ -634,7 +810,7 @@
         </w:tc>
         <w:tc>
           <w:tcPr>
-            <w:tcW w:type="dxa" w:w="1080"/>
+            <w:tcW w:type="dxa" w:w="960"/>
           </w:tcPr>
           <w:p>
             <w:r>
@@ -646,7 +822,7 @@
       <w:tr>
         <w:tc>
           <w:tcPr>
-            <w:tcW w:type="dxa" w:w="1080"/>
+            <w:tcW w:type="dxa" w:w="960"/>
           </w:tcPr>
           <w:p>
             <w:r>
@@ -656,7 +832,7 @@
         </w:tc>
         <w:tc>
           <w:tcPr>
-            <w:tcW w:type="dxa" w:w="1080"/>
+            <w:tcW w:type="dxa" w:w="960"/>
           </w:tcPr>
           <w:p>
             <w:r>
@@ -666,7 +842,7 @@
         </w:tc>
         <w:tc>
           <w:tcPr>
-            <w:tcW w:type="dxa" w:w="1080"/>
+            <w:tcW w:type="dxa" w:w="960"/>
           </w:tcPr>
           <w:p>
             <w:r>
@@ -676,7 +852,7 @@
         </w:tc>
         <w:tc>
           <w:tcPr>
-            <w:tcW w:type="dxa" w:w="1080"/>
+            <w:tcW w:type="dxa" w:w="960"/>
           </w:tcPr>
           <w:p>
             <w:r>
@@ -686,17 +862,31 @@
         </w:tc>
         <w:tc>
           <w:tcPr>
-            <w:tcW w:type="dxa" w:w="1080"/>
-          </w:tcPr>
-          <w:p>
-            <w:r>
+            <w:tcW w:type="dxa" w:w="960"/>
+          </w:tcPr>
+          <w:p>
+            <w:r>
+              <w:t>Prueba medible / ultrasonido limpio</w:t>
+            </w:r>
+          </w:p>
+        </w:tc>
+        <w:tc>
+          <w:tcPr>
+            <w:tcW w:type="dxa" w:w="960"/>
+          </w:tcPr>
+          <w:p>
+            <w:r>
+              <w:rPr>
+                <w:rFonts w:ascii="Consolas" w:hAnsi="Consolas"/>
+                <w:color w:val="C03030"/>
+              </w:rPr>
               <w:t>EV551a30df75aa</w:t>
             </w:r>
           </w:p>
         </w:tc>
         <w:tc>
           <w:tcPr>
-            <w:tcW w:type="dxa" w:w="1080"/>
+            <w:tcW w:type="dxa" w:w="960"/>
           </w:tcPr>
           <w:p>
             <w:r>
@@ -706,7 +896,7 @@
         </w:tc>
         <w:tc>
           <w:tcPr>
-            <w:tcW w:type="dxa" w:w="1080"/>
+            <w:tcW w:type="dxa" w:w="960"/>
           </w:tcPr>
           <w:p>
             <w:r>
@@ -716,7 +906,7 @@
         </w:tc>
         <w:tc>
           <w:tcPr>
-            <w:tcW w:type="dxa" w:w="1080"/>
+            <w:tcW w:type="dxa" w:w="960"/>
           </w:tcPr>
           <w:p>
             <w:r>
@@ -728,7 +918,7 @@
       <w:tr>
         <w:tc>
           <w:tcPr>
-            <w:tcW w:type="dxa" w:w="1080"/>
+            <w:tcW w:type="dxa" w:w="960"/>
           </w:tcPr>
           <w:p>
             <w:r>
@@ -738,7 +928,7 @@
         </w:tc>
         <w:tc>
           <w:tcPr>
-            <w:tcW w:type="dxa" w:w="1080"/>
+            <w:tcW w:type="dxa" w:w="960"/>
           </w:tcPr>
           <w:p>
             <w:r>
@@ -748,7 +938,7 @@
         </w:tc>
         <w:tc>
           <w:tcPr>
-            <w:tcW w:type="dxa" w:w="1080"/>
+            <w:tcW w:type="dxa" w:w="960"/>
           </w:tcPr>
           <w:p>
             <w:r>
@@ -758,7 +948,7 @@
         </w:tc>
         <w:tc>
           <w:tcPr>
-            <w:tcW w:type="dxa" w:w="1080"/>
+            <w:tcW w:type="dxa" w:w="960"/>
           </w:tcPr>
           <w:p>
             <w:r>
@@ -768,17 +958,31 @@
         </w:tc>
         <w:tc>
           <w:tcPr>
-            <w:tcW w:type="dxa" w:w="1080"/>
-          </w:tcPr>
-          <w:p>
-            <w:r>
+            <w:tcW w:type="dxa" w:w="960"/>
+          </w:tcPr>
+          <w:p>
+            <w:r>
+              <w:t>Fe como marco / esperanza redentora</w:t>
+            </w:r>
+          </w:p>
+        </w:tc>
+        <w:tc>
+          <w:tcPr>
+            <w:tcW w:type="dxa" w:w="960"/>
+          </w:tcPr>
+          <w:p>
+            <w:r>
+              <w:rPr>
+                <w:rFonts w:ascii="Consolas" w:hAnsi="Consolas"/>
+                <w:color w:val="C03030"/>
+              </w:rPr>
               <w:t>EVb25aac5fff83</w:t>
             </w:r>
           </w:p>
         </w:tc>
         <w:tc>
           <w:tcPr>
-            <w:tcW w:type="dxa" w:w="1080"/>
+            <w:tcW w:type="dxa" w:w="960"/>
           </w:tcPr>
           <w:p>
             <w:r>
@@ -788,7 +992,7 @@
         </w:tc>
         <w:tc>
           <w:tcPr>
-            <w:tcW w:type="dxa" w:w="1080"/>
+            <w:tcW w:type="dxa" w:w="960"/>
           </w:tcPr>
           <w:p>
             <w:r>
@@ -798,7 +1002,7 @@
         </w:tc>
         <w:tc>
           <w:tcPr>
-            <w:tcW w:type="dxa" w:w="1080"/>
+            <w:tcW w:type="dxa" w:w="960"/>
           </w:tcPr>
           <w:p>
             <w:r>
@@ -810,7 +1014,7 @@
       <w:tr>
         <w:tc>
           <w:tcPr>
-            <w:tcW w:type="dxa" w:w="1080"/>
+            <w:tcW w:type="dxa" w:w="960"/>
           </w:tcPr>
           <w:p>
             <w:r>
@@ -820,7 +1024,7 @@
         </w:tc>
         <w:tc>
           <w:tcPr>
-            <w:tcW w:type="dxa" w:w="1080"/>
+            <w:tcW w:type="dxa" w:w="960"/>
           </w:tcPr>
           <w:p>
             <w:r>
@@ -830,7 +1034,7 @@
         </w:tc>
         <w:tc>
           <w:tcPr>
-            <w:tcW w:type="dxa" w:w="1080"/>
+            <w:tcW w:type="dxa" w:w="960"/>
           </w:tcPr>
           <w:p>
             <w:r>
@@ -840,7 +1044,7 @@
         </w:tc>
         <w:tc>
           <w:tcPr>
-            <w:tcW w:type="dxa" w:w="1080"/>
+            <w:tcW w:type="dxa" w:w="960"/>
           </w:tcPr>
           <w:p>
             <w:r>
@@ -850,17 +1054,31 @@
         </w:tc>
         <w:tc>
           <w:tcPr>
-            <w:tcW w:type="dxa" w:w="1080"/>
-          </w:tcPr>
-          <w:p>
-            <w:r>
+            <w:tcW w:type="dxa" w:w="960"/>
+          </w:tcPr>
+          <w:p>
+            <w:r>
+              <w:t>Objeción seguridad / interacción con medicina</w:t>
+            </w:r>
+          </w:p>
+        </w:tc>
+        <w:tc>
+          <w:tcPr>
+            <w:tcW w:type="dxa" w:w="960"/>
+          </w:tcPr>
+          <w:p>
+            <w:r>
+              <w:rPr>
+                <w:rFonts w:ascii="Consolas" w:hAnsi="Consolas"/>
+                <w:color w:val="C03030"/>
+              </w:rPr>
               <w:t>EVa81d501174fa</w:t>
             </w:r>
           </w:p>
         </w:tc>
         <w:tc>
           <w:tcPr>
-            <w:tcW w:type="dxa" w:w="1080"/>
+            <w:tcW w:type="dxa" w:w="960"/>
           </w:tcPr>
           <w:p>
             <w:r>
@@ -870,7 +1088,7 @@
         </w:tc>
         <w:tc>
           <w:tcPr>
-            <w:tcW w:type="dxa" w:w="1080"/>
+            <w:tcW w:type="dxa" w:w="960"/>
           </w:tcPr>
           <w:p>
             <w:r>
@@ -880,7 +1098,7 @@
         </w:tc>
         <w:tc>
           <w:tcPr>
-            <w:tcW w:type="dxa" w:w="1080"/>
+            <w:tcW w:type="dxa" w:w="960"/>
           </w:tcPr>
           <w:p>
             <w:r>
@@ -892,7 +1110,7 @@
       <w:tr>
         <w:tc>
           <w:tcPr>
-            <w:tcW w:type="dxa" w:w="1080"/>
+            <w:tcW w:type="dxa" w:w="960"/>
           </w:tcPr>
           <w:p>
             <w:r>
@@ -902,7 +1120,7 @@
         </w:tc>
         <w:tc>
           <w:tcPr>
-            <w:tcW w:type="dxa" w:w="1080"/>
+            <w:tcW w:type="dxa" w:w="960"/>
           </w:tcPr>
           <w:p>
             <w:r>
@@ -912,7 +1130,7 @@
         </w:tc>
         <w:tc>
           <w:tcPr>
-            <w:tcW w:type="dxa" w:w="1080"/>
+            <w:tcW w:type="dxa" w:w="960"/>
           </w:tcPr>
           <w:p>
             <w:r>
@@ -922,7 +1140,7 @@
         </w:tc>
         <w:tc>
           <w:tcPr>
-            <w:tcW w:type="dxa" w:w="1080"/>
+            <w:tcW w:type="dxa" w:w="960"/>
           </w:tcPr>
           <w:p>
             <w:r>
@@ -932,17 +1150,31 @@
         </w:tc>
         <w:tc>
           <w:tcPr>
-            <w:tcW w:type="dxa" w:w="1080"/>
-          </w:tcPr>
-          <w:p>
-            <w:r>
+            <w:tcW w:type="dxa" w:w="960"/>
+          </w:tcPr>
+          <w:p>
+            <w:r>
+              <w:t>Objeción seguridad / interacción con medicina</w:t>
+            </w:r>
+          </w:p>
+        </w:tc>
+        <w:tc>
+          <w:tcPr>
+            <w:tcW w:type="dxa" w:w="960"/>
+          </w:tcPr>
+          <w:p>
+            <w:r>
+              <w:rPr>
+                <w:rFonts w:ascii="Consolas" w:hAnsi="Consolas"/>
+                <w:color w:val="C03030"/>
+              </w:rPr>
               <w:t>EV4f66daea204a</w:t>
             </w:r>
           </w:p>
         </w:tc>
         <w:tc>
           <w:tcPr>
-            <w:tcW w:type="dxa" w:w="1080"/>
+            <w:tcW w:type="dxa" w:w="960"/>
           </w:tcPr>
           <w:p>
             <w:r>
@@ -952,7 +1184,7 @@
         </w:tc>
         <w:tc>
           <w:tcPr>
-            <w:tcW w:type="dxa" w:w="1080"/>
+            <w:tcW w:type="dxa" w:w="960"/>
           </w:tcPr>
           <w:p>
             <w:r>
@@ -962,7 +1194,7 @@
         </w:tc>
         <w:tc>
           <w:tcPr>
-            <w:tcW w:type="dxa" w:w="1080"/>
+            <w:tcW w:type="dxa" w:w="960"/>
           </w:tcPr>
           <w:p>
             <w:r>
@@ -974,7 +1206,7 @@
       <w:tr>
         <w:tc>
           <w:tcPr>
-            <w:tcW w:type="dxa" w:w="1080"/>
+            <w:tcW w:type="dxa" w:w="960"/>
           </w:tcPr>
           <w:p>
             <w:r>
@@ -984,7 +1216,7 @@
         </w:tc>
         <w:tc>
           <w:tcPr>
-            <w:tcW w:type="dxa" w:w="1080"/>
+            <w:tcW w:type="dxa" w:w="960"/>
           </w:tcPr>
           <w:p>
             <w:r>
@@ -994,7 +1226,7 @@
         </w:tc>
         <w:tc>
           <w:tcPr>
-            <w:tcW w:type="dxa" w:w="1080"/>
+            <w:tcW w:type="dxa" w:w="960"/>
           </w:tcPr>
           <w:p>
             <w:r>
@@ -1004,7 +1236,7 @@
         </w:tc>
         <w:tc>
           <w:tcPr>
-            <w:tcW w:type="dxa" w:w="1080"/>
+            <w:tcW w:type="dxa" w:w="960"/>
           </w:tcPr>
           <w:p>
             <w:r>
@@ -1014,17 +1246,31 @@
         </w:tc>
         <w:tc>
           <w:tcPr>
-            <w:tcW w:type="dxa" w:w="1080"/>
-          </w:tcPr>
-          <w:p>
-            <w:r>
+            <w:tcW w:type="dxa" w:w="960"/>
+          </w:tcPr>
+          <w:p>
+            <w:r>
+              <w:t>Villano DIY / facilidad de las gotas</w:t>
+            </w:r>
+          </w:p>
+        </w:tc>
+        <w:tc>
+          <w:tcPr>
+            <w:tcW w:type="dxa" w:w="960"/>
+          </w:tcPr>
+          <w:p>
+            <w:r>
+              <w:rPr>
+                <w:rFonts w:ascii="Consolas" w:hAnsi="Consolas"/>
+                <w:color w:val="C03030"/>
+              </w:rPr>
               <w:t>EV6bf181681ddd</w:t>
             </w:r>
           </w:p>
         </w:tc>
         <w:tc>
           <w:tcPr>
-            <w:tcW w:type="dxa" w:w="1080"/>
+            <w:tcW w:type="dxa" w:w="960"/>
           </w:tcPr>
           <w:p>
             <w:r>
@@ -1034,7 +1280,7 @@
         </w:tc>
         <w:tc>
           <w:tcPr>
-            <w:tcW w:type="dxa" w:w="1080"/>
+            <w:tcW w:type="dxa" w:w="960"/>
           </w:tcPr>
           <w:p>
             <w:r>
@@ -1044,7 +1290,7 @@
         </w:tc>
         <w:tc>
           <w:tcPr>
-            <w:tcW w:type="dxa" w:w="1080"/>
+            <w:tcW w:type="dxa" w:w="960"/>
           </w:tcPr>
           <w:p>
             <w:r>
@@ -1056,7 +1302,7 @@
       <w:tr>
         <w:tc>
           <w:tcPr>
-            <w:tcW w:type="dxa" w:w="1080"/>
+            <w:tcW w:type="dxa" w:w="960"/>
           </w:tcPr>
           <w:p>
             <w:r>
@@ -1066,7 +1312,7 @@
         </w:tc>
         <w:tc>
           <w:tcPr>
-            <w:tcW w:type="dxa" w:w="1080"/>
+            <w:tcW w:type="dxa" w:w="960"/>
           </w:tcPr>
           <w:p>
             <w:r>
@@ -1076,7 +1322,7 @@
         </w:tc>
         <w:tc>
           <w:tcPr>
-            <w:tcW w:type="dxa" w:w="1080"/>
+            <w:tcW w:type="dxa" w:w="960"/>
           </w:tcPr>
           <w:p>
             <w:r>
@@ -1086,7 +1332,7 @@
         </w:tc>
         <w:tc>
           <w:tcPr>
-            <w:tcW w:type="dxa" w:w="1080"/>
+            <w:tcW w:type="dxa" w:w="960"/>
           </w:tcPr>
           <w:p>
             <w:r>
@@ -1096,17 +1342,31 @@
         </w:tc>
         <w:tc>
           <w:tcPr>
-            <w:tcW w:type="dxa" w:w="1080"/>
-          </w:tcPr>
-          <w:p>
-            <w:r>
+            <w:tcW w:type="dxa" w:w="960"/>
+          </w:tcPr>
+          <w:p>
+            <w:r>
+              <w:t>Villano DIY / remedios a medias</w:t>
+            </w:r>
+          </w:p>
+        </w:tc>
+        <w:tc>
+          <w:tcPr>
+            <w:tcW w:type="dxa" w:w="960"/>
+          </w:tcPr>
+          <w:p>
+            <w:r>
+              <w:rPr>
+                <w:rFonts w:ascii="Consolas" w:hAnsi="Consolas"/>
+                <w:color w:val="C03030"/>
+              </w:rPr>
               <w:t>EVf1bed71ead4d</w:t>
             </w:r>
           </w:p>
         </w:tc>
         <w:tc>
           <w:tcPr>
-            <w:tcW w:type="dxa" w:w="1080"/>
+            <w:tcW w:type="dxa" w:w="960"/>
           </w:tcPr>
           <w:p>
             <w:r>
@@ -1116,7 +1376,7 @@
         </w:tc>
         <w:tc>
           <w:tcPr>
-            <w:tcW w:type="dxa" w:w="1080"/>
+            <w:tcW w:type="dxa" w:w="960"/>
           </w:tcPr>
           <w:p>
             <w:r>
@@ -1126,7 +1386,7 @@
         </w:tc>
         <w:tc>
           <w:tcPr>
-            <w:tcW w:type="dxa" w:w="1080"/>
+            <w:tcW w:type="dxa" w:w="960"/>
           </w:tcPr>
           <w:p>
             <w:r>
@@ -1139,7 +1399,7 @@
     <w:p/>
     <w:p>
       <w:pPr>
-        <w:pStyle w:val="Heading1"/>
+        <w:pStyle w:val="Heading2"/>
       </w:pPr>
       <w:r>
         <w:t>Seguridad + Prueba + Mecanismo</w:t>
@@ -1152,19 +1412,20 @@
         <w:tblLook w:firstColumn="1" w:firstRow="1" w:lastColumn="0" w:lastRow="0" w:noHBand="0" w:noVBand="1" w:val="04A0"/>
       </w:tblPr>
       <w:tblGrid>
-        <w:gridCol w:w="1080"/>
-        <w:gridCol w:w="1080"/>
-        <w:gridCol w:w="1080"/>
-        <w:gridCol w:w="1080"/>
-        <w:gridCol w:w="1080"/>
-        <w:gridCol w:w="1080"/>
-        <w:gridCol w:w="1080"/>
-        <w:gridCol w:w="1080"/>
+        <w:gridCol w:w="960"/>
+        <w:gridCol w:w="960"/>
+        <w:gridCol w:w="960"/>
+        <w:gridCol w:w="960"/>
+        <w:gridCol w:w="960"/>
+        <w:gridCol w:w="960"/>
+        <w:gridCol w:w="960"/>
+        <w:gridCol w:w="960"/>
+        <w:gridCol w:w="960"/>
       </w:tblGrid>
       <w:tr>
         <w:tc>
           <w:tcPr>
-            <w:tcW w:type="dxa" w:w="1080"/>
+            <w:tcW w:type="dxa" w:w="960"/>
           </w:tcPr>
           <w:p>
             <w:r>
@@ -1177,7 +1438,7 @@
         </w:tc>
         <w:tc>
           <w:tcPr>
-            <w:tcW w:type="dxa" w:w="1080"/>
+            <w:tcW w:type="dxa" w:w="960"/>
           </w:tcPr>
           <w:p>
             <w:r>
@@ -1190,7 +1451,7 @@
         </w:tc>
         <w:tc>
           <w:tcPr>
-            <w:tcW w:type="dxa" w:w="1080"/>
+            <w:tcW w:type="dxa" w:w="960"/>
           </w:tcPr>
           <w:p>
             <w:r>
@@ -1203,7 +1464,7 @@
         </w:tc>
         <w:tc>
           <w:tcPr>
-            <w:tcW w:type="dxa" w:w="1080"/>
+            <w:tcW w:type="dxa" w:w="960"/>
           </w:tcPr>
           <w:p>
             <w:r>
@@ -1216,7 +1477,20 @@
         </w:tc>
         <w:tc>
           <w:tcPr>
-            <w:tcW w:type="dxa" w:w="1080"/>
+            <w:tcW w:type="dxa" w:w="960"/>
+          </w:tcPr>
+          <w:p>
+            <w:r>
+              <w:rPr>
+                <w:b/>
+              </w:rPr>
+              <w:t>Cluster</w:t>
+            </w:r>
+          </w:p>
+        </w:tc>
+        <w:tc>
+          <w:tcPr>
+            <w:tcW w:type="dxa" w:w="960"/>
           </w:tcPr>
           <w:p>
             <w:r>
@@ -1229,7 +1503,7 @@
         </w:tc>
         <w:tc>
           <w:tcPr>
-            <w:tcW w:type="dxa" w:w="1080"/>
+            <w:tcW w:type="dxa" w:w="960"/>
           </w:tcPr>
           <w:p>
             <w:r>
@@ -1242,7 +1516,7 @@
         </w:tc>
         <w:tc>
           <w:tcPr>
-            <w:tcW w:type="dxa" w:w="1080"/>
+            <w:tcW w:type="dxa" w:w="960"/>
           </w:tcPr>
           <w:p>
             <w:r>
@@ -1255,7 +1529,7 @@
         </w:tc>
         <w:tc>
           <w:tcPr>
-            <w:tcW w:type="dxa" w:w="1080"/>
+            <w:tcW w:type="dxa" w:w="960"/>
           </w:tcPr>
           <w:p>
             <w:r>
@@ -1270,7 +1544,7 @@
       <w:tr>
         <w:tc>
           <w:tcPr>
-            <w:tcW w:type="dxa" w:w="1080"/>
+            <w:tcW w:type="dxa" w:w="960"/>
           </w:tcPr>
           <w:p>
             <w:r>
@@ -1280,7 +1554,7 @@
         </w:tc>
         <w:tc>
           <w:tcPr>
-            <w:tcW w:type="dxa" w:w="1080"/>
+            <w:tcW w:type="dxa" w:w="960"/>
           </w:tcPr>
           <w:p>
             <w:r>
@@ -1290,7 +1564,7 @@
         </w:tc>
         <w:tc>
           <w:tcPr>
-            <w:tcW w:type="dxa" w:w="1080"/>
+            <w:tcW w:type="dxa" w:w="960"/>
           </w:tcPr>
           <w:p>
             <w:r>
@@ -1300,7 +1574,7 @@
         </w:tc>
         <w:tc>
           <w:tcPr>
-            <w:tcW w:type="dxa" w:w="1080"/>
+            <w:tcW w:type="dxa" w:w="960"/>
           </w:tcPr>
           <w:p>
             <w:r>
@@ -1310,17 +1584,31 @@
         </w:tc>
         <w:tc>
           <w:tcPr>
-            <w:tcW w:type="dxa" w:w="1080"/>
-          </w:tcPr>
-          <w:p>
-            <w:r>
+            <w:tcW w:type="dxa" w:w="960"/>
+          </w:tcPr>
+          <w:p>
+            <w:r>
+              <w:t>seguridad_interaccion_medicamento</w:t>
+            </w:r>
+          </w:p>
+        </w:tc>
+        <w:tc>
+          <w:tcPr>
+            <w:tcW w:type="dxa" w:w="960"/>
+          </w:tcPr>
+          <w:p>
+            <w:r>
+              <w:rPr>
+                <w:rFonts w:ascii="Consolas" w:hAnsi="Consolas"/>
+                <w:color w:val="C03030"/>
+              </w:rPr>
               <w:t>EV4f66daea204a</w:t>
             </w:r>
           </w:p>
         </w:tc>
         <w:tc>
           <w:tcPr>
-            <w:tcW w:type="dxa" w:w="1080"/>
+            <w:tcW w:type="dxa" w:w="960"/>
           </w:tcPr>
           <w:p>
             <w:r>
@@ -1330,7 +1618,7 @@
         </w:tc>
         <w:tc>
           <w:tcPr>
-            <w:tcW w:type="dxa" w:w="1080"/>
+            <w:tcW w:type="dxa" w:w="960"/>
           </w:tcPr>
           <w:p>
             <w:r>
@@ -1340,7 +1628,7 @@
         </w:tc>
         <w:tc>
           <w:tcPr>
-            <w:tcW w:type="dxa" w:w="1080"/>
+            <w:tcW w:type="dxa" w:w="960"/>
           </w:tcPr>
           <w:p>
             <w:r>
@@ -1352,7 +1640,7 @@
       <w:tr>
         <w:tc>
           <w:tcPr>
-            <w:tcW w:type="dxa" w:w="1080"/>
+            <w:tcW w:type="dxa" w:w="960"/>
           </w:tcPr>
           <w:p>
             <w:r>
@@ -1362,7 +1650,7 @@
         </w:tc>
         <w:tc>
           <w:tcPr>
-            <w:tcW w:type="dxa" w:w="1080"/>
+            <w:tcW w:type="dxa" w:w="960"/>
           </w:tcPr>
           <w:p>
             <w:r>
@@ -1372,7 +1660,7 @@
         </w:tc>
         <w:tc>
           <w:tcPr>
-            <w:tcW w:type="dxa" w:w="1080"/>
+            <w:tcW w:type="dxa" w:w="960"/>
           </w:tcPr>
           <w:p>
             <w:r>
@@ -1382,7 +1670,7 @@
         </w:tc>
         <w:tc>
           <w:tcPr>
-            <w:tcW w:type="dxa" w:w="1080"/>
+            <w:tcW w:type="dxa" w:w="960"/>
           </w:tcPr>
           <w:p>
             <w:r>
@@ -1392,17 +1680,31 @@
         </w:tc>
         <w:tc>
           <w:tcPr>
-            <w:tcW w:type="dxa" w:w="1080"/>
-          </w:tcPr>
-          <w:p>
-            <w:r>
+            <w:tcW w:type="dxa" w:w="960"/>
+          </w:tcPr>
+          <w:p>
+            <w:r>
+              <w:t>seguridad_consulta_medico</w:t>
+            </w:r>
+          </w:p>
+        </w:tc>
+        <w:tc>
+          <w:tcPr>
+            <w:tcW w:type="dxa" w:w="960"/>
+          </w:tcPr>
+          <w:p>
+            <w:r>
+              <w:rPr>
+                <w:rFonts w:ascii="Consolas" w:hAnsi="Consolas"/>
+                <w:color w:val="C03030"/>
+              </w:rPr>
               <w:t>EVa975dbd810fc</w:t>
             </w:r>
           </w:p>
         </w:tc>
         <w:tc>
           <w:tcPr>
-            <w:tcW w:type="dxa" w:w="1080"/>
+            <w:tcW w:type="dxa" w:w="960"/>
           </w:tcPr>
           <w:p>
             <w:r>
@@ -1412,7 +1714,7 @@
         </w:tc>
         <w:tc>
           <w:tcPr>
-            <w:tcW w:type="dxa" w:w="1080"/>
+            <w:tcW w:type="dxa" w:w="960"/>
           </w:tcPr>
           <w:p>
             <w:r>
@@ -1422,7 +1724,7 @@
         </w:tc>
         <w:tc>
           <w:tcPr>
-            <w:tcW w:type="dxa" w:w="1080"/>
+            <w:tcW w:type="dxa" w:w="960"/>
           </w:tcPr>
           <w:p>
             <w:r>
@@ -1434,7 +1736,7 @@
       <w:tr>
         <w:tc>
           <w:tcPr>
-            <w:tcW w:type="dxa" w:w="1080"/>
+            <w:tcW w:type="dxa" w:w="960"/>
           </w:tcPr>
           <w:p>
             <w:r>
@@ -1444,7 +1746,7 @@
         </w:tc>
         <w:tc>
           <w:tcPr>
-            <w:tcW w:type="dxa" w:w="1080"/>
+            <w:tcW w:type="dxa" w:w="960"/>
           </w:tcPr>
           <w:p>
             <w:r>
@@ -1454,7 +1756,7 @@
         </w:tc>
         <w:tc>
           <w:tcPr>
-            <w:tcW w:type="dxa" w:w="1080"/>
+            <w:tcW w:type="dxa" w:w="960"/>
           </w:tcPr>
           <w:p>
             <w:r>
@@ -1464,7 +1766,7 @@
         </w:tc>
         <w:tc>
           <w:tcPr>
-            <w:tcW w:type="dxa" w:w="1080"/>
+            <w:tcW w:type="dxa" w:w="960"/>
           </w:tcPr>
           <w:p>
             <w:r>
@@ -1474,17 +1776,31 @@
         </w:tc>
         <w:tc>
           <w:tcPr>
-            <w:tcW w:type="dxa" w:w="1080"/>
-          </w:tcPr>
-          <w:p>
-            <w:r>
+            <w:tcW w:type="dxa" w:w="960"/>
+          </w:tcPr>
+          <w:p>
+            <w:r>
+              <w:t>seguridad_dosis_natural</w:t>
+            </w:r>
+          </w:p>
+        </w:tc>
+        <w:tc>
+          <w:tcPr>
+            <w:tcW w:type="dxa" w:w="960"/>
+          </w:tcPr>
+          <w:p>
+            <w:r>
+              <w:rPr>
+                <w:rFonts w:ascii="Consolas" w:hAnsi="Consolas"/>
+                <w:color w:val="C03030"/>
+              </w:rPr>
               <w:t>EVa81d501174fa</w:t>
             </w:r>
           </w:p>
         </w:tc>
         <w:tc>
           <w:tcPr>
-            <w:tcW w:type="dxa" w:w="1080"/>
+            <w:tcW w:type="dxa" w:w="960"/>
           </w:tcPr>
           <w:p>
             <w:r>
@@ -1494,7 +1810,7 @@
         </w:tc>
         <w:tc>
           <w:tcPr>
-            <w:tcW w:type="dxa" w:w="1080"/>
+            <w:tcW w:type="dxa" w:w="960"/>
           </w:tcPr>
           <w:p>
             <w:r>
@@ -1504,7 +1820,7 @@
         </w:tc>
         <w:tc>
           <w:tcPr>
-            <w:tcW w:type="dxa" w:w="1080"/>
+            <w:tcW w:type="dxa" w:w="960"/>
           </w:tcPr>
           <w:p>
             <w:r>
@@ -1516,7 +1832,7 @@
       <w:tr>
         <w:tc>
           <w:tcPr>
-            <w:tcW w:type="dxa" w:w="1080"/>
+            <w:tcW w:type="dxa" w:w="960"/>
           </w:tcPr>
           <w:p>
             <w:r>
@@ -1526,7 +1842,7 @@
         </w:tc>
         <w:tc>
           <w:tcPr>
-            <w:tcW w:type="dxa" w:w="1080"/>
+            <w:tcW w:type="dxa" w:w="960"/>
           </w:tcPr>
           <w:p>
             <w:r>
@@ -1536,7 +1852,7 @@
         </w:tc>
         <w:tc>
           <w:tcPr>
-            <w:tcW w:type="dxa" w:w="1080"/>
+            <w:tcW w:type="dxa" w:w="960"/>
           </w:tcPr>
           <w:p>
             <w:r>
@@ -1546,7 +1862,7 @@
         </w:tc>
         <w:tc>
           <w:tcPr>
-            <w:tcW w:type="dxa" w:w="1080"/>
+            <w:tcW w:type="dxa" w:w="960"/>
           </w:tcPr>
           <w:p>
             <w:r>
@@ -1556,17 +1872,31 @@
         </w:tc>
         <w:tc>
           <w:tcPr>
-            <w:tcW w:type="dxa" w:w="1080"/>
-          </w:tcPr>
-          <w:p>
-            <w:r>
+            <w:tcW w:type="dxa" w:w="960"/>
+          </w:tcPr>
+          <w:p>
+            <w:r>
+              <w:t>seguridad_intestino_suave</w:t>
+            </w:r>
+          </w:p>
+        </w:tc>
+        <w:tc>
+          <w:tcPr>
+            <w:tcW w:type="dxa" w:w="960"/>
+          </w:tcPr>
+          <w:p>
+            <w:r>
+              <w:rPr>
+                <w:rFonts w:ascii="Consolas" w:hAnsi="Consolas"/>
+                <w:color w:val="C03030"/>
+              </w:rPr>
               <w:t>EVecfdcb339361</w:t>
             </w:r>
           </w:p>
         </w:tc>
         <w:tc>
           <w:tcPr>
-            <w:tcW w:type="dxa" w:w="1080"/>
+            <w:tcW w:type="dxa" w:w="960"/>
           </w:tcPr>
           <w:p>
             <w:r>
@@ -1576,7 +1906,7 @@
         </w:tc>
         <w:tc>
           <w:tcPr>
-            <w:tcW w:type="dxa" w:w="1080"/>
+            <w:tcW w:type="dxa" w:w="960"/>
           </w:tcPr>
           <w:p>
             <w:r>
@@ -1586,7 +1916,7 @@
         </w:tc>
         <w:tc>
           <w:tcPr>
-            <w:tcW w:type="dxa" w:w="1080"/>
+            <w:tcW w:type="dxa" w:w="960"/>
           </w:tcPr>
           <w:p>
             <w:r>
@@ -1598,7 +1928,7 @@
       <w:tr>
         <w:tc>
           <w:tcPr>
-            <w:tcW w:type="dxa" w:w="1080"/>
+            <w:tcW w:type="dxa" w:w="960"/>
           </w:tcPr>
           <w:p>
             <w:r>
@@ -1608,7 +1938,7 @@
         </w:tc>
         <w:tc>
           <w:tcPr>
-            <w:tcW w:type="dxa" w:w="1080"/>
+            <w:tcW w:type="dxa" w:w="960"/>
           </w:tcPr>
           <w:p>
             <w:r>
@@ -1618,7 +1948,7 @@
         </w:tc>
         <w:tc>
           <w:tcPr>
-            <w:tcW w:type="dxa" w:w="1080"/>
+            <w:tcW w:type="dxa" w:w="960"/>
           </w:tcPr>
           <w:p>
             <w:r>
@@ -1628,7 +1958,7 @@
         </w:tc>
         <w:tc>
           <w:tcPr>
-            <w:tcW w:type="dxa" w:w="1080"/>
+            <w:tcW w:type="dxa" w:w="960"/>
           </w:tcPr>
           <w:p>
             <w:r>
@@ -1638,17 +1968,31 @@
         </w:tc>
         <w:tc>
           <w:tcPr>
-            <w:tcW w:type="dxa" w:w="1080"/>
-          </w:tcPr>
-          <w:p>
-            <w:r>
+            <w:tcW w:type="dxa" w:w="960"/>
+          </w:tcPr>
+          <w:p>
+            <w:r>
+              <w:t>seguridad_ingrediente_auditable</w:t>
+            </w:r>
+          </w:p>
+        </w:tc>
+        <w:tc>
+          <w:tcPr>
+            <w:tcW w:type="dxa" w:w="960"/>
+          </w:tcPr>
+          <w:p>
+            <w:r>
+              <w:rPr>
+                <w:rFonts w:ascii="Consolas" w:hAnsi="Consolas"/>
+                <w:color w:val="C03030"/>
+              </w:rPr>
               <w:t>EVa7633fc26169</w:t>
             </w:r>
           </w:p>
         </w:tc>
         <w:tc>
           <w:tcPr>
-            <w:tcW w:type="dxa" w:w="1080"/>
+            <w:tcW w:type="dxa" w:w="960"/>
           </w:tcPr>
           <w:p>
             <w:r>
@@ -1658,7 +2002,7 @@
         </w:tc>
         <w:tc>
           <w:tcPr>
-            <w:tcW w:type="dxa" w:w="1080"/>
+            <w:tcW w:type="dxa" w:w="960"/>
           </w:tcPr>
           <w:p>
             <w:r>
@@ -1668,7 +2012,7 @@
         </w:tc>
         <w:tc>
           <w:tcPr>
-            <w:tcW w:type="dxa" w:w="1080"/>
+            <w:tcW w:type="dxa" w:w="960"/>
           </w:tcPr>
           <w:p>
             <w:r>
@@ -1680,7 +2024,7 @@
       <w:tr>
         <w:tc>
           <w:tcPr>
-            <w:tcW w:type="dxa" w:w="1080"/>
+            <w:tcW w:type="dxa" w:w="960"/>
           </w:tcPr>
           <w:p>
             <w:r>
@@ -1690,7 +2034,7 @@
         </w:tc>
         <w:tc>
           <w:tcPr>
-            <w:tcW w:type="dxa" w:w="1080"/>
+            <w:tcW w:type="dxa" w:w="960"/>
           </w:tcPr>
           <w:p>
             <w:r>
@@ -1700,7 +2044,7 @@
         </w:tc>
         <w:tc>
           <w:tcPr>
-            <w:tcW w:type="dxa" w:w="1080"/>
+            <w:tcW w:type="dxa" w:w="960"/>
           </w:tcPr>
           <w:p>
             <w:r>
@@ -1710,7 +2054,7 @@
         </w:tc>
         <w:tc>
           <w:tcPr>
-            <w:tcW w:type="dxa" w:w="1080"/>
+            <w:tcW w:type="dxa" w:w="960"/>
           </w:tcPr>
           <w:p>
             <w:r>
@@ -1720,17 +2064,31 @@
         </w:tc>
         <w:tc>
           <w:tcPr>
-            <w:tcW w:type="dxa" w:w="1080"/>
-          </w:tcPr>
-          <w:p>
-            <w:r>
+            <w:tcW w:type="dxa" w:w="960"/>
+          </w:tcPr>
+          <w:p>
+            <w:r>
+              <w:t>prueba_ultrasonido_limpio</w:t>
+            </w:r>
+          </w:p>
+        </w:tc>
+        <w:tc>
+          <w:tcPr>
+            <w:tcW w:type="dxa" w:w="960"/>
+          </w:tcPr>
+          <w:p>
+            <w:r>
+              <w:rPr>
+                <w:rFonts w:ascii="Consolas" w:hAnsi="Consolas"/>
+                <w:color w:val="C03030"/>
+              </w:rPr>
               <w:t>EV551a30df75aa</w:t>
             </w:r>
           </w:p>
         </w:tc>
         <w:tc>
           <w:tcPr>
-            <w:tcW w:type="dxa" w:w="1080"/>
+            <w:tcW w:type="dxa" w:w="960"/>
           </w:tcPr>
           <w:p>
             <w:r>
@@ -1740,7 +2098,7 @@
         </w:tc>
         <w:tc>
           <w:tcPr>
-            <w:tcW w:type="dxa" w:w="1080"/>
+            <w:tcW w:type="dxa" w:w="960"/>
           </w:tcPr>
           <w:p>
             <w:r>
@@ -1750,7 +2108,7 @@
         </w:tc>
         <w:tc>
           <w:tcPr>
-            <w:tcW w:type="dxa" w:w="1080"/>
+            <w:tcW w:type="dxa" w:w="960"/>
           </w:tcPr>
           <w:p>
             <w:r>
@@ -1762,7 +2120,7 @@
       <w:tr>
         <w:tc>
           <w:tcPr>
-            <w:tcW w:type="dxa" w:w="1080"/>
+            <w:tcW w:type="dxa" w:w="960"/>
           </w:tcPr>
           <w:p>
             <w:r>
@@ -1772,7 +2130,7 @@
         </w:tc>
         <w:tc>
           <w:tcPr>
-            <w:tcW w:type="dxa" w:w="1080"/>
+            <w:tcW w:type="dxa" w:w="960"/>
           </w:tcPr>
           <w:p>
             <w:r>
@@ -1782,7 +2140,7 @@
         </w:tc>
         <w:tc>
           <w:tcPr>
-            <w:tcW w:type="dxa" w:w="1080"/>
+            <w:tcW w:type="dxa" w:w="960"/>
           </w:tcPr>
           <w:p>
             <w:r>
@@ -1792,7 +2150,7 @@
         </w:tc>
         <w:tc>
           <w:tcPr>
-            <w:tcW w:type="dxa" w:w="1080"/>
+            <w:tcW w:type="dxa" w:w="960"/>
           </w:tcPr>
           <w:p>
             <w:r>
@@ -1802,17 +2160,31 @@
         </w:tc>
         <w:tc>
           <w:tcPr>
-            <w:tcW w:type="dxa" w:w="1080"/>
-          </w:tcPr>
-          <w:p>
-            <w:r>
+            <w:tcW w:type="dxa" w:w="960"/>
+          </w:tcPr>
+          <w:p>
+            <w:r>
+              <w:t>prueba_cifra_tiempo</w:t>
+            </w:r>
+          </w:p>
+        </w:tc>
+        <w:tc>
+          <w:tcPr>
+            <w:tcW w:type="dxa" w:w="960"/>
+          </w:tcPr>
+          <w:p>
+            <w:r>
+              <w:rPr>
+                <w:rFonts w:ascii="Consolas" w:hAnsi="Consolas"/>
+                <w:color w:val="C03030"/>
+              </w:rPr>
               <w:t>EVec2e8ff832dc</w:t>
             </w:r>
           </w:p>
         </w:tc>
         <w:tc>
           <w:tcPr>
-            <w:tcW w:type="dxa" w:w="1080"/>
+            <w:tcW w:type="dxa" w:w="960"/>
           </w:tcPr>
           <w:p>
             <w:r>
@@ -1822,7 +2194,7 @@
         </w:tc>
         <w:tc>
           <w:tcPr>
-            <w:tcW w:type="dxa" w:w="1080"/>
+            <w:tcW w:type="dxa" w:w="960"/>
           </w:tcPr>
           <w:p>
             <w:r>
@@ -1832,7 +2204,7 @@
         </w:tc>
         <w:tc>
           <w:tcPr>
-            <w:tcW w:type="dxa" w:w="1080"/>
+            <w:tcW w:type="dxa" w:w="960"/>
           </w:tcPr>
           <w:p>
             <w:r>
@@ -1844,7 +2216,7 @@
       <w:tr>
         <w:tc>
           <w:tcPr>
-            <w:tcW w:type="dxa" w:w="1080"/>
+            <w:tcW w:type="dxa" w:w="960"/>
           </w:tcPr>
           <w:p>
             <w:r>
@@ -1854,7 +2226,7 @@
         </w:tc>
         <w:tc>
           <w:tcPr>
-            <w:tcW w:type="dxa" w:w="1080"/>
+            <w:tcW w:type="dxa" w:w="960"/>
           </w:tcPr>
           <w:p>
             <w:r>
@@ -1864,7 +2236,7 @@
         </w:tc>
         <w:tc>
           <w:tcPr>
-            <w:tcW w:type="dxa" w:w="1080"/>
+            <w:tcW w:type="dxa" w:w="960"/>
           </w:tcPr>
           <w:p>
             <w:r>
@@ -1874,7 +2246,7 @@
         </w:tc>
         <w:tc>
           <w:tcPr>
-            <w:tcW w:type="dxa" w:w="1080"/>
+            <w:tcW w:type="dxa" w:w="960"/>
           </w:tcPr>
           <w:p>
             <w:r>
@@ -1884,17 +2256,31 @@
         </w:tc>
         <w:tc>
           <w:tcPr>
-            <w:tcW w:type="dxa" w:w="1080"/>
-          </w:tcPr>
-          <w:p>
-            <w:r>
+            <w:tcW w:type="dxa" w:w="960"/>
+          </w:tcPr>
+          <w:p>
+            <w:r>
+              <w:t>prueba_ultrasonido_medico_sorprendido</w:t>
+            </w:r>
+          </w:p>
+        </w:tc>
+        <w:tc>
+          <w:tcPr>
+            <w:tcW w:type="dxa" w:w="960"/>
+          </w:tcPr>
+          <w:p>
+            <w:r>
+              <w:rPr>
+                <w:rFonts w:ascii="Consolas" w:hAnsi="Consolas"/>
+                <w:color w:val="C03030"/>
+              </w:rPr>
               <w:t>EVfb3f73b5ebc0</w:t>
             </w:r>
           </w:p>
         </w:tc>
         <w:tc>
           <w:tcPr>
-            <w:tcW w:type="dxa" w:w="1080"/>
+            <w:tcW w:type="dxa" w:w="960"/>
           </w:tcPr>
           <w:p>
             <w:r>
@@ -1904,7 +2290,7 @@
         </w:tc>
         <w:tc>
           <w:tcPr>
-            <w:tcW w:type="dxa" w:w="1080"/>
+            <w:tcW w:type="dxa" w:w="960"/>
           </w:tcPr>
           <w:p>
             <w:r>
@@ -1914,7 +2300,7 @@
         </w:tc>
         <w:tc>
           <w:tcPr>
-            <w:tcW w:type="dxa" w:w="1080"/>
+            <w:tcW w:type="dxa" w:w="960"/>
           </w:tcPr>
           <w:p>
             <w:r>
@@ -1926,7 +2312,7 @@
       <w:tr>
         <w:tc>
           <w:tcPr>
-            <w:tcW w:type="dxa" w:w="1080"/>
+            <w:tcW w:type="dxa" w:w="960"/>
           </w:tcPr>
           <w:p>
             <w:r>
@@ -1936,7 +2322,7 @@
         </w:tc>
         <w:tc>
           <w:tcPr>
-            <w:tcW w:type="dxa" w:w="1080"/>
+            <w:tcW w:type="dxa" w:w="960"/>
           </w:tcPr>
           <w:p>
             <w:r>
@@ -1946,7 +2332,7 @@
         </w:tc>
         <w:tc>
           <w:tcPr>
-            <w:tcW w:type="dxa" w:w="1080"/>
+            <w:tcW w:type="dxa" w:w="960"/>
           </w:tcPr>
           <w:p>
             <w:r>
@@ -1956,7 +2342,7 @@
         </w:tc>
         <w:tc>
           <w:tcPr>
-            <w:tcW w:type="dxa" w:w="1080"/>
+            <w:tcW w:type="dxa" w:w="960"/>
           </w:tcPr>
           <w:p>
             <w:r>
@@ -1966,17 +2352,31 @@
         </w:tc>
         <w:tc>
           <w:tcPr>
-            <w:tcW w:type="dxa" w:w="1080"/>
-          </w:tcPr>
-          <w:p>
-            <w:r>
+            <w:tcW w:type="dxa" w:w="960"/>
+          </w:tcPr>
+          <w:p>
+            <w:r>
+              <w:t>mecanismo_bilis_alcachofa</w:t>
+            </w:r>
+          </w:p>
+        </w:tc>
+        <w:tc>
+          <w:tcPr>
+            <w:tcW w:type="dxa" w:w="960"/>
+          </w:tcPr>
+          <w:p>
+            <w:r>
+              <w:rPr>
+                <w:rFonts w:ascii="Consolas" w:hAnsi="Consolas"/>
+                <w:color w:val="C03030"/>
+              </w:rPr>
               <w:t>EVd6a1a1a6bb01</w:t>
             </w:r>
           </w:p>
         </w:tc>
         <w:tc>
           <w:tcPr>
-            <w:tcW w:type="dxa" w:w="1080"/>
+            <w:tcW w:type="dxa" w:w="960"/>
           </w:tcPr>
           <w:p>
             <w:r>
@@ -1986,7 +2386,7 @@
         </w:tc>
         <w:tc>
           <w:tcPr>
-            <w:tcW w:type="dxa" w:w="1080"/>
+            <w:tcW w:type="dxa" w:w="960"/>
           </w:tcPr>
           <w:p>
             <w:r>
@@ -1996,7 +2396,7 @@
         </w:tc>
         <w:tc>
           <w:tcPr>
-            <w:tcW w:type="dxa" w:w="1080"/>
+            <w:tcW w:type="dxa" w:w="960"/>
           </w:tcPr>
           <w:p>
             <w:r>
@@ -2008,7 +2408,7 @@
       <w:tr>
         <w:tc>
           <w:tcPr>
-            <w:tcW w:type="dxa" w:w="1080"/>
+            <w:tcW w:type="dxa" w:w="960"/>
           </w:tcPr>
           <w:p>
             <w:r>
@@ -2018,7 +2418,7 @@
         </w:tc>
         <w:tc>
           <w:tcPr>
-            <w:tcW w:type="dxa" w:w="1080"/>
+            <w:tcW w:type="dxa" w:w="960"/>
           </w:tcPr>
           <w:p>
             <w:r>
@@ -2028,7 +2428,7 @@
         </w:tc>
         <w:tc>
           <w:tcPr>
-            <w:tcW w:type="dxa" w:w="1080"/>
+            <w:tcW w:type="dxa" w:w="960"/>
           </w:tcPr>
           <w:p>
             <w:r>
@@ -2038,7 +2438,7 @@
         </w:tc>
         <w:tc>
           <w:tcPr>
-            <w:tcW w:type="dxa" w:w="1080"/>
+            <w:tcW w:type="dxa" w:w="960"/>
           </w:tcPr>
           <w:p>
             <w:r>
@@ -2048,17 +2448,31 @@
         </w:tc>
         <w:tc>
           <w:tcPr>
-            <w:tcW w:type="dxa" w:w="1080"/>
-          </w:tcPr>
-          <w:p>
-            <w:r>
+            <w:tcW w:type="dxa" w:w="960"/>
+          </w:tcPr>
+          <w:p>
+            <w:r>
+              <w:t>mecanismo_limpiar_higado_dosificado</w:t>
+            </w:r>
+          </w:p>
+        </w:tc>
+        <w:tc>
+          <w:tcPr>
+            <w:tcW w:type="dxa" w:w="960"/>
+          </w:tcPr>
+          <w:p>
+            <w:r>
+              <w:rPr>
+                <w:rFonts w:ascii="Consolas" w:hAnsi="Consolas"/>
+                <w:color w:val="C03030"/>
+              </w:rPr>
               <w:t>EV103445ddfd2a</w:t>
             </w:r>
           </w:p>
         </w:tc>
         <w:tc>
           <w:tcPr>
-            <w:tcW w:type="dxa" w:w="1080"/>
+            <w:tcW w:type="dxa" w:w="960"/>
           </w:tcPr>
           <w:p>
             <w:r>
@@ -2068,7 +2482,7 @@
         </w:tc>
         <w:tc>
           <w:tcPr>
-            <w:tcW w:type="dxa" w:w="1080"/>
+            <w:tcW w:type="dxa" w:w="960"/>
           </w:tcPr>
           <w:p>
             <w:r>
@@ -2078,7 +2492,7 @@
         </w:tc>
         <w:tc>
           <w:tcPr>
-            <w:tcW w:type="dxa" w:w="1080"/>
+            <w:tcW w:type="dxa" w:w="960"/>
           </w:tcPr>
           <w:p>
             <w:r>
@@ -2090,7 +2504,7 @@
       <w:tr>
         <w:tc>
           <w:tcPr>
-            <w:tcW w:type="dxa" w:w="1080"/>
+            <w:tcW w:type="dxa" w:w="960"/>
           </w:tcPr>
           <w:p>
             <w:r>
@@ -2100,7 +2514,7 @@
         </w:tc>
         <w:tc>
           <w:tcPr>
-            <w:tcW w:type="dxa" w:w="1080"/>
+            <w:tcW w:type="dxa" w:w="960"/>
           </w:tcPr>
           <w:p>
             <w:r>
@@ -2110,7 +2524,7 @@
         </w:tc>
         <w:tc>
           <w:tcPr>
-            <w:tcW w:type="dxa" w:w="1080"/>
+            <w:tcW w:type="dxa" w:w="960"/>
           </w:tcPr>
           <w:p>
             <w:r>
@@ -2120,7 +2534,7 @@
         </w:tc>
         <w:tc>
           <w:tcPr>
-            <w:tcW w:type="dxa" w:w="1080"/>
+            <w:tcW w:type="dxa" w:w="960"/>
           </w:tcPr>
           <w:p>
             <w:r>
@@ -2130,17 +2544,31 @@
         </w:tc>
         <w:tc>
           <w:tcPr>
-            <w:tcW w:type="dxa" w:w="1080"/>
-          </w:tcPr>
-          <w:p>
-            <w:r>
+            <w:tcW w:type="dxa" w:w="960"/>
+          </w:tcPr>
+          <w:p>
+            <w:r>
+              <w:t>villano_diy_ritual_diario</w:t>
+            </w:r>
+          </w:p>
+        </w:tc>
+        <w:tc>
+          <w:tcPr>
+            <w:tcW w:type="dxa" w:w="960"/>
+          </w:tcPr>
+          <w:p>
+            <w:r>
+              <w:rPr>
+                <w:rFonts w:ascii="Consolas" w:hAnsi="Consolas"/>
+                <w:color w:val="C03030"/>
+              </w:rPr>
               <w:t>EV395aeee91c7c</w:t>
             </w:r>
           </w:p>
         </w:tc>
         <w:tc>
           <w:tcPr>
-            <w:tcW w:type="dxa" w:w="1080"/>
+            <w:tcW w:type="dxa" w:w="960"/>
           </w:tcPr>
           <w:p>
             <w:r>
@@ -2150,7 +2578,7 @@
         </w:tc>
         <w:tc>
           <w:tcPr>
-            <w:tcW w:type="dxa" w:w="1080"/>
+            <w:tcW w:type="dxa" w:w="960"/>
           </w:tcPr>
           <w:p>
             <w:r>
@@ -2160,7 +2588,7 @@
         </w:tc>
         <w:tc>
           <w:tcPr>
-            <w:tcW w:type="dxa" w:w="1080"/>
+            <w:tcW w:type="dxa" w:w="960"/>
           </w:tcPr>
           <w:p>
             <w:r>
@@ -2172,7 +2600,7 @@
       <w:tr>
         <w:tc>
           <w:tcPr>
-            <w:tcW w:type="dxa" w:w="1080"/>
+            <w:tcW w:type="dxa" w:w="960"/>
           </w:tcPr>
           <w:p>
             <w:r>
@@ -2182,7 +2610,7 @@
         </w:tc>
         <w:tc>
           <w:tcPr>
-            <w:tcW w:type="dxa" w:w="1080"/>
+            <w:tcW w:type="dxa" w:w="960"/>
           </w:tcPr>
           <w:p>
             <w:r>
@@ -2192,7 +2620,7 @@
         </w:tc>
         <w:tc>
           <w:tcPr>
-            <w:tcW w:type="dxa" w:w="1080"/>
+            <w:tcW w:type="dxa" w:w="960"/>
           </w:tcPr>
           <w:p>
             <w:r>
@@ -2202,7 +2630,7 @@
         </w:tc>
         <w:tc>
           <w:tcPr>
-            <w:tcW w:type="dxa" w:w="1080"/>
+            <w:tcW w:type="dxa" w:w="960"/>
           </w:tcPr>
           <w:p>
             <w:r>
@@ -2212,17 +2640,31 @@
         </w:tc>
         <w:tc>
           <w:tcPr>
-            <w:tcW w:type="dxa" w:w="1080"/>
-          </w:tcPr>
-          <w:p>
-            <w:r>
+            <w:tcW w:type="dxa" w:w="960"/>
+          </w:tcPr>
+          <w:p>
+            <w:r>
+              <w:t>villano_diy_preparar_diario</w:t>
+            </w:r>
+          </w:p>
+        </w:tc>
+        <w:tc>
+          <w:tcPr>
+            <w:tcW w:type="dxa" w:w="960"/>
+          </w:tcPr>
+          <w:p>
+            <w:r>
+              <w:rPr>
+                <w:rFonts w:ascii="Consolas" w:hAnsi="Consolas"/>
+                <w:color w:val="C03030"/>
+              </w:rPr>
               <w:t>EV54ec0294eec2</w:t>
             </w:r>
           </w:p>
         </w:tc>
         <w:tc>
           <w:tcPr>
-            <w:tcW w:type="dxa" w:w="1080"/>
+            <w:tcW w:type="dxa" w:w="960"/>
           </w:tcPr>
           <w:p>
             <w:r>
@@ -2232,7 +2674,7 @@
         </w:tc>
         <w:tc>
           <w:tcPr>
-            <w:tcW w:type="dxa" w:w="1080"/>
+            <w:tcW w:type="dxa" w:w="960"/>
           </w:tcPr>
           <w:p>
             <w:r>
@@ -2242,7 +2684,7 @@
         </w:tc>
         <w:tc>
           <w:tcPr>
-            <w:tcW w:type="dxa" w:w="1080"/>
+            <w:tcW w:type="dxa" w:w="960"/>
           </w:tcPr>
           <w:p>
             <w:r>
@@ -2255,7 +2697,7 @@
     <w:p/>
     <w:p>
       <w:pPr>
-        <w:pStyle w:val="Heading1"/>
+        <w:pStyle w:val="Heading2"/>
       </w:pPr>
       <w:r>
         <w:t>Cabeza de Playa — Hinchazón (frío, a validar)</w:t>
@@ -2268,19 +2710,20 @@
         <w:tblLook w:firstColumn="1" w:firstRow="1" w:lastColumn="0" w:lastRow="0" w:noHBand="0" w:noVBand="1" w:val="04A0"/>
       </w:tblPr>
       <w:tblGrid>
-        <w:gridCol w:w="1080"/>
-        <w:gridCol w:w="1080"/>
-        <w:gridCol w:w="1080"/>
-        <w:gridCol w:w="1080"/>
-        <w:gridCol w:w="1080"/>
-        <w:gridCol w:w="1080"/>
-        <w:gridCol w:w="1080"/>
-        <w:gridCol w:w="1080"/>
+        <w:gridCol w:w="960"/>
+        <w:gridCol w:w="960"/>
+        <w:gridCol w:w="960"/>
+        <w:gridCol w:w="960"/>
+        <w:gridCol w:w="960"/>
+        <w:gridCol w:w="960"/>
+        <w:gridCol w:w="960"/>
+        <w:gridCol w:w="960"/>
+        <w:gridCol w:w="960"/>
       </w:tblGrid>
       <w:tr>
         <w:tc>
           <w:tcPr>
-            <w:tcW w:type="dxa" w:w="1080"/>
+            <w:tcW w:type="dxa" w:w="960"/>
           </w:tcPr>
           <w:p>
             <w:r>
@@ -2293,7 +2736,7 @@
         </w:tc>
         <w:tc>
           <w:tcPr>
-            <w:tcW w:type="dxa" w:w="1080"/>
+            <w:tcW w:type="dxa" w:w="960"/>
           </w:tcPr>
           <w:p>
             <w:r>
@@ -2306,7 +2749,7 @@
         </w:tc>
         <w:tc>
           <w:tcPr>
-            <w:tcW w:type="dxa" w:w="1080"/>
+            <w:tcW w:type="dxa" w:w="960"/>
           </w:tcPr>
           <w:p>
             <w:r>
@@ -2319,7 +2762,7 @@
         </w:tc>
         <w:tc>
           <w:tcPr>
-            <w:tcW w:type="dxa" w:w="1080"/>
+            <w:tcW w:type="dxa" w:w="960"/>
           </w:tcPr>
           <w:p>
             <w:r>
@@ -2332,7 +2775,20 @@
         </w:tc>
         <w:tc>
           <w:tcPr>
-            <w:tcW w:type="dxa" w:w="1080"/>
+            <w:tcW w:type="dxa" w:w="960"/>
+          </w:tcPr>
+          <w:p>
+            <w:r>
+              <w:rPr>
+                <w:b/>
+              </w:rPr>
+              <w:t>Cluster</w:t>
+            </w:r>
+          </w:p>
+        </w:tc>
+        <w:tc>
+          <w:tcPr>
+            <w:tcW w:type="dxa" w:w="960"/>
           </w:tcPr>
           <w:p>
             <w:r>
@@ -2345,7 +2801,7 @@
         </w:tc>
         <w:tc>
           <w:tcPr>
-            <w:tcW w:type="dxa" w:w="1080"/>
+            <w:tcW w:type="dxa" w:w="960"/>
           </w:tcPr>
           <w:p>
             <w:r>
@@ -2358,7 +2814,7 @@
         </w:tc>
         <w:tc>
           <w:tcPr>
-            <w:tcW w:type="dxa" w:w="1080"/>
+            <w:tcW w:type="dxa" w:w="960"/>
           </w:tcPr>
           <w:p>
             <w:r>
@@ -2371,7 +2827,7 @@
         </w:tc>
         <w:tc>
           <w:tcPr>
-            <w:tcW w:type="dxa" w:w="1080"/>
+            <w:tcW w:type="dxa" w:w="960"/>
           </w:tcPr>
           <w:p>
             <w:r>
@@ -2386,7 +2842,7 @@
       <w:tr>
         <w:tc>
           <w:tcPr>
-            <w:tcW w:type="dxa" w:w="1080"/>
+            <w:tcW w:type="dxa" w:w="960"/>
           </w:tcPr>
           <w:p>
             <w:r>
@@ -2396,7 +2852,7 @@
         </w:tc>
         <w:tc>
           <w:tcPr>
-            <w:tcW w:type="dxa" w:w="1080"/>
+            <w:tcW w:type="dxa" w:w="960"/>
           </w:tcPr>
           <w:p>
             <w:r>
@@ -2406,7 +2862,7 @@
         </w:tc>
         <w:tc>
           <w:tcPr>
-            <w:tcW w:type="dxa" w:w="1080"/>
+            <w:tcW w:type="dxa" w:w="960"/>
           </w:tcPr>
           <w:p>
             <w:r>
@@ -2416,7 +2872,7 @@
         </w:tc>
         <w:tc>
           <w:tcPr>
-            <w:tcW w:type="dxa" w:w="1080"/>
+            <w:tcW w:type="dxa" w:w="960"/>
           </w:tcPr>
           <w:p>
             <w:r>
@@ -2426,17 +2882,31 @@
         </w:tc>
         <w:tc>
           <w:tcPr>
-            <w:tcW w:type="dxa" w:w="1080"/>
-          </w:tcPr>
-          <w:p>
-            <w:r>
+            <w:tcW w:type="dxa" w:w="960"/>
+          </w:tcPr>
+          <w:p>
+            <w:r>
+              <w:t>Puente hinchazón→hígado como testimonio</w:t>
+            </w:r>
+          </w:p>
+        </w:tc>
+        <w:tc>
+          <w:tcPr>
+            <w:tcW w:type="dxa" w:w="960"/>
+          </w:tcPr>
+          <w:p>
+            <w:r>
+              <w:rPr>
+                <w:rFonts w:ascii="Consolas" w:hAnsi="Consolas"/>
+                <w:color w:val="C03030"/>
+              </w:rPr>
               <w:t>EV9937651191c6</w:t>
             </w:r>
           </w:p>
         </w:tc>
         <w:tc>
           <w:tcPr>
-            <w:tcW w:type="dxa" w:w="1080"/>
+            <w:tcW w:type="dxa" w:w="960"/>
           </w:tcPr>
           <w:p>
             <w:r>
@@ -2446,7 +2916,7 @@
         </w:tc>
         <w:tc>
           <w:tcPr>
-            <w:tcW w:type="dxa" w:w="1080"/>
+            <w:tcW w:type="dxa" w:w="960"/>
           </w:tcPr>
           <w:p>
             <w:r>
@@ -2456,7 +2926,7 @@
         </w:tc>
         <w:tc>
           <w:tcPr>
-            <w:tcW w:type="dxa" w:w="1080"/>
+            <w:tcW w:type="dxa" w:w="960"/>
           </w:tcPr>
           <w:p>
             <w:r>
@@ -2468,7 +2938,7 @@
       <w:tr>
         <w:tc>
           <w:tcPr>
-            <w:tcW w:type="dxa" w:w="1080"/>
+            <w:tcW w:type="dxa" w:w="960"/>
           </w:tcPr>
           <w:p>
             <w:r>
@@ -2478,7 +2948,7 @@
         </w:tc>
         <w:tc>
           <w:tcPr>
-            <w:tcW w:type="dxa" w:w="1080"/>
+            <w:tcW w:type="dxa" w:w="960"/>
           </w:tcPr>
           <w:p>
             <w:r>
@@ -2488,7 +2958,7 @@
         </w:tc>
         <w:tc>
           <w:tcPr>
-            <w:tcW w:type="dxa" w:w="1080"/>
+            <w:tcW w:type="dxa" w:w="960"/>
           </w:tcPr>
           <w:p>
             <w:r>
@@ -2498,7 +2968,7 @@
         </w:tc>
         <w:tc>
           <w:tcPr>
-            <w:tcW w:type="dxa" w:w="1080"/>
+            <w:tcW w:type="dxa" w:w="960"/>
           </w:tcPr>
           <w:p>
             <w:r>
@@ -2508,17 +2978,31 @@
         </w:tc>
         <w:tc>
           <w:tcPr>
-            <w:tcW w:type="dxa" w:w="1080"/>
-          </w:tcPr>
-          <w:p>
-            <w:r>
+            <w:tcW w:type="dxa" w:w="960"/>
+          </w:tcPr>
+          <w:p>
+            <w:r>
+              <w:t>Humillación social 'parezco embarazada'</w:t>
+            </w:r>
+          </w:p>
+        </w:tc>
+        <w:tc>
+          <w:tcPr>
+            <w:tcW w:type="dxa" w:w="960"/>
+          </w:tcPr>
+          <w:p>
+            <w:r>
+              <w:rPr>
+                <w:rFonts w:ascii="Consolas" w:hAnsi="Consolas"/>
+                <w:color w:val="C03030"/>
+              </w:rPr>
               <w:t>EV896a667c600d</w:t>
             </w:r>
           </w:p>
         </w:tc>
         <w:tc>
           <w:tcPr>
-            <w:tcW w:type="dxa" w:w="1080"/>
+            <w:tcW w:type="dxa" w:w="960"/>
           </w:tcPr>
           <w:p>
             <w:r>
@@ -2528,7 +3012,7 @@
         </w:tc>
         <w:tc>
           <w:tcPr>
-            <w:tcW w:type="dxa" w:w="1080"/>
+            <w:tcW w:type="dxa" w:w="960"/>
           </w:tcPr>
           <w:p>
             <w:r>
@@ -2538,7 +3022,7 @@
         </w:tc>
         <w:tc>
           <w:tcPr>
-            <w:tcW w:type="dxa" w:w="1080"/>
+            <w:tcW w:type="dxa" w:w="960"/>
           </w:tcPr>
           <w:p>
             <w:r>
@@ -2550,7 +3034,7 @@
       <w:tr>
         <w:tc>
           <w:tcPr>
-            <w:tcW w:type="dxa" w:w="1080"/>
+            <w:tcW w:type="dxa" w:w="960"/>
           </w:tcPr>
           <w:p>
             <w:r>
@@ -2560,7 +3044,7 @@
         </w:tc>
         <w:tc>
           <w:tcPr>
-            <w:tcW w:type="dxa" w:w="1080"/>
+            <w:tcW w:type="dxa" w:w="960"/>
           </w:tcPr>
           <w:p>
             <w:r>
@@ -2570,7 +3054,7 @@
         </w:tc>
         <w:tc>
           <w:tcPr>
-            <w:tcW w:type="dxa" w:w="1080"/>
+            <w:tcW w:type="dxa" w:w="960"/>
           </w:tcPr>
           <w:p>
             <w:r>
@@ -2580,7 +3064,7 @@
         </w:tc>
         <w:tc>
           <w:tcPr>
-            <w:tcW w:type="dxa" w:w="1080"/>
+            <w:tcW w:type="dxa" w:w="960"/>
           </w:tcPr>
           <w:p>
             <w:r>
@@ -2590,17 +3074,31 @@
         </w:tc>
         <w:tc>
           <w:tcPr>
-            <w:tcW w:type="dxa" w:w="1080"/>
-          </w:tcPr>
-          <w:p>
-            <w:r>
+            <w:tcW w:type="dxa" w:w="960"/>
+          </w:tcPr>
+          <w:p>
+            <w:r>
+              <w:t>Humillación social 'parezco embarazada'</w:t>
+            </w:r>
+          </w:p>
+        </w:tc>
+        <w:tc>
+          <w:tcPr>
+            <w:tcW w:type="dxa" w:w="960"/>
+          </w:tcPr>
+          <w:p>
+            <w:r>
+              <w:rPr>
+                <w:rFonts w:ascii="Consolas" w:hAnsi="Consolas"/>
+                <w:color w:val="C03030"/>
+              </w:rPr>
               <w:t>EV9e5bfa9edeaa</w:t>
             </w:r>
           </w:p>
         </w:tc>
         <w:tc>
           <w:tcPr>
-            <w:tcW w:type="dxa" w:w="1080"/>
+            <w:tcW w:type="dxa" w:w="960"/>
           </w:tcPr>
           <w:p>
             <w:r>
@@ -2610,7 +3108,7 @@
         </w:tc>
         <w:tc>
           <w:tcPr>
-            <w:tcW w:type="dxa" w:w="1080"/>
+            <w:tcW w:type="dxa" w:w="960"/>
           </w:tcPr>
           <w:p>
             <w:r>
@@ -2620,7 +3118,7 @@
         </w:tc>
         <w:tc>
           <w:tcPr>
-            <w:tcW w:type="dxa" w:w="1080"/>
+            <w:tcW w:type="dxa" w:w="960"/>
           </w:tcPr>
           <w:p>
             <w:r>
@@ -2632,7 +3130,7 @@
       <w:tr>
         <w:tc>
           <w:tcPr>
-            <w:tcW w:type="dxa" w:w="1080"/>
+            <w:tcW w:type="dxa" w:w="960"/>
           </w:tcPr>
           <w:p>
             <w:r>
@@ -2642,7 +3140,7 @@
         </w:tc>
         <w:tc>
           <w:tcPr>
-            <w:tcW w:type="dxa" w:w="1080"/>
+            <w:tcW w:type="dxa" w:w="960"/>
           </w:tcPr>
           <w:p>
             <w:r>
@@ -2652,7 +3150,7 @@
         </w:tc>
         <w:tc>
           <w:tcPr>
-            <w:tcW w:type="dxa" w:w="1080"/>
+            <w:tcW w:type="dxa" w:w="960"/>
           </w:tcPr>
           <w:p>
             <w:r>
@@ -2662,7 +3160,7 @@
         </w:tc>
         <w:tc>
           <w:tcPr>
-            <w:tcW w:type="dxa" w:w="1080"/>
+            <w:tcW w:type="dxa" w:w="960"/>
           </w:tcPr>
           <w:p>
             <w:r>
@@ -2672,17 +3170,31 @@
         </w:tc>
         <w:tc>
           <w:tcPr>
-            <w:tcW w:type="dxa" w:w="1080"/>
-          </w:tcPr>
-          <w:p>
-            <w:r>
+            <w:tcW w:type="dxa" w:w="960"/>
+          </w:tcPr>
+          <w:p>
+            <w:r>
+              <w:t>Humillación social 'parezco embarazada'</w:t>
+            </w:r>
+          </w:p>
+        </w:tc>
+        <w:tc>
+          <w:tcPr>
+            <w:tcW w:type="dxa" w:w="960"/>
+          </w:tcPr>
+          <w:p>
+            <w:r>
+              <w:rPr>
+                <w:rFonts w:ascii="Consolas" w:hAnsi="Consolas"/>
+                <w:color w:val="C03030"/>
+              </w:rPr>
               <w:t>EVb72cbfeeb711</w:t>
             </w:r>
           </w:p>
         </w:tc>
         <w:tc>
           <w:tcPr>
-            <w:tcW w:type="dxa" w:w="1080"/>
+            <w:tcW w:type="dxa" w:w="960"/>
           </w:tcPr>
           <w:p>
             <w:r>
@@ -2692,7 +3204,7 @@
         </w:tc>
         <w:tc>
           <w:tcPr>
-            <w:tcW w:type="dxa" w:w="1080"/>
+            <w:tcW w:type="dxa" w:w="960"/>
           </w:tcPr>
           <w:p>
             <w:r>
@@ -2702,7 +3214,7 @@
         </w:tc>
         <w:tc>
           <w:tcPr>
-            <w:tcW w:type="dxa" w:w="1080"/>
+            <w:tcW w:type="dxa" w:w="960"/>
           </w:tcPr>
           <w:p>
             <w:r>
@@ -2714,7 +3226,7 @@
       <w:tr>
         <w:tc>
           <w:tcPr>
-            <w:tcW w:type="dxa" w:w="1080"/>
+            <w:tcW w:type="dxa" w:w="960"/>
           </w:tcPr>
           <w:p>
             <w:r>
@@ -2724,7 +3236,7 @@
         </w:tc>
         <w:tc>
           <w:tcPr>
-            <w:tcW w:type="dxa" w:w="1080"/>
+            <w:tcW w:type="dxa" w:w="960"/>
           </w:tcPr>
           <w:p>
             <w:r>
@@ -2734,7 +3246,7 @@
         </w:tc>
         <w:tc>
           <w:tcPr>
-            <w:tcW w:type="dxa" w:w="1080"/>
+            <w:tcW w:type="dxa" w:w="960"/>
           </w:tcPr>
           <w:p>
             <w:r>
@@ -2744,7 +3256,7 @@
         </w:tc>
         <w:tc>
           <w:tcPr>
-            <w:tcW w:type="dxa" w:w="1080"/>
+            <w:tcW w:type="dxa" w:w="960"/>
           </w:tcPr>
           <w:p>
             <w:r>
@@ -2754,17 +3266,31 @@
         </w:tc>
         <w:tc>
           <w:tcPr>
-            <w:tcW w:type="dxa" w:w="1080"/>
-          </w:tcPr>
-          <w:p>
-            <w:r>
+            <w:tcW w:type="dxa" w:w="960"/>
+          </w:tcPr>
+          <w:p>
+            <w:r>
+              <w:t>Hinchazón constante no cíclica</w:t>
+            </w:r>
+          </w:p>
+        </w:tc>
+        <w:tc>
+          <w:tcPr>
+            <w:tcW w:type="dxa" w:w="960"/>
+          </w:tcPr>
+          <w:p>
+            <w:r>
+              <w:rPr>
+                <w:rFonts w:ascii="Consolas" w:hAnsi="Consolas"/>
+                <w:color w:val="C03030"/>
+              </w:rPr>
               <w:t>EV772a697227e9</w:t>
             </w:r>
           </w:p>
         </w:tc>
         <w:tc>
           <w:tcPr>
-            <w:tcW w:type="dxa" w:w="1080"/>
+            <w:tcW w:type="dxa" w:w="960"/>
           </w:tcPr>
           <w:p>
             <w:r>
@@ -2774,7 +3300,7 @@
         </w:tc>
         <w:tc>
           <w:tcPr>
-            <w:tcW w:type="dxa" w:w="1080"/>
+            <w:tcW w:type="dxa" w:w="960"/>
           </w:tcPr>
           <w:p>
             <w:r>
@@ -2784,7 +3310,7 @@
         </w:tc>
         <w:tc>
           <w:tcPr>
-            <w:tcW w:type="dxa" w:w="1080"/>
+            <w:tcW w:type="dxa" w:w="960"/>
           </w:tcPr>
           <w:p>
             <w:r>
@@ -2796,7 +3322,7 @@
       <w:tr>
         <w:tc>
           <w:tcPr>
-            <w:tcW w:type="dxa" w:w="1080"/>
+            <w:tcW w:type="dxa" w:w="960"/>
           </w:tcPr>
           <w:p>
             <w:r>
@@ -2806,7 +3332,7 @@
         </w:tc>
         <w:tc>
           <w:tcPr>
-            <w:tcW w:type="dxa" w:w="1080"/>
+            <w:tcW w:type="dxa" w:w="960"/>
           </w:tcPr>
           <w:p>
             <w:r>
@@ -2816,7 +3342,7 @@
         </w:tc>
         <w:tc>
           <w:tcPr>
-            <w:tcW w:type="dxa" w:w="1080"/>
+            <w:tcW w:type="dxa" w:w="960"/>
           </w:tcPr>
           <w:p>
             <w:r>
@@ -2826,7 +3352,7 @@
         </w:tc>
         <w:tc>
           <w:tcPr>
-            <w:tcW w:type="dxa" w:w="1080"/>
+            <w:tcW w:type="dxa" w:w="960"/>
           </w:tcPr>
           <w:p>
             <w:r>
@@ -2836,17 +3362,31 @@
         </w:tc>
         <w:tc>
           <w:tcPr>
-            <w:tcW w:type="dxa" w:w="1080"/>
-          </w:tcPr>
-          <w:p>
-            <w:r>
+            <w:tcW w:type="dxa" w:w="960"/>
+          </w:tcPr>
+          <w:p>
+            <w:r>
+              <w:t>Hinchazón constante no cíclica</w:t>
+            </w:r>
+          </w:p>
+        </w:tc>
+        <w:tc>
+          <w:tcPr>
+            <w:tcW w:type="dxa" w:w="960"/>
+          </w:tcPr>
+          <w:p>
+            <w:r>
+              <w:rPr>
+                <w:rFonts w:ascii="Consolas" w:hAnsi="Consolas"/>
+                <w:color w:val="C03030"/>
+              </w:rPr>
               <w:t>EV949d31514d28</w:t>
             </w:r>
           </w:p>
         </w:tc>
         <w:tc>
           <w:tcPr>
-            <w:tcW w:type="dxa" w:w="1080"/>
+            <w:tcW w:type="dxa" w:w="960"/>
           </w:tcPr>
           <w:p>
             <w:r>
@@ -2856,7 +3396,7 @@
         </w:tc>
         <w:tc>
           <w:tcPr>
-            <w:tcW w:type="dxa" w:w="1080"/>
+            <w:tcW w:type="dxa" w:w="960"/>
           </w:tcPr>
           <w:p>
             <w:r>
@@ -2866,7 +3406,7 @@
         </w:tc>
         <w:tc>
           <w:tcPr>
-            <w:tcW w:type="dxa" w:w="1080"/>
+            <w:tcW w:type="dxa" w:w="960"/>
           </w:tcPr>
           <w:p>
             <w:r>
@@ -2878,7 +3418,7 @@
       <w:tr>
         <w:tc>
           <w:tcPr>
-            <w:tcW w:type="dxa" w:w="1080"/>
+            <w:tcW w:type="dxa" w:w="960"/>
           </w:tcPr>
           <w:p>
             <w:r>
@@ -2888,7 +3428,7 @@
         </w:tc>
         <w:tc>
           <w:tcPr>
-            <w:tcW w:type="dxa" w:w="1080"/>
+            <w:tcW w:type="dxa" w:w="960"/>
           </w:tcPr>
           <w:p>
             <w:r>
@@ -2898,7 +3438,7 @@
         </w:tc>
         <w:tc>
           <w:tcPr>
-            <w:tcW w:type="dxa" w:w="1080"/>
+            <w:tcW w:type="dxa" w:w="960"/>
           </w:tcPr>
           <w:p>
             <w:r>
@@ -2908,7 +3448,7 @@
         </w:tc>
         <w:tc>
           <w:tcPr>
-            <w:tcW w:type="dxa" w:w="1080"/>
+            <w:tcW w:type="dxa" w:w="960"/>
           </w:tcPr>
           <w:p>
             <w:r>
@@ -2918,17 +3458,31 @@
         </w:tc>
         <w:tc>
           <w:tcPr>
-            <w:tcW w:type="dxa" w:w="1080"/>
-          </w:tcPr>
-          <w:p>
-            <w:r>
+            <w:tcW w:type="dxa" w:w="960"/>
+          </w:tcPr>
+          <w:p>
+            <w:r>
+              <w:t>Humillación social 'parezco embarazada'</w:t>
+            </w:r>
+          </w:p>
+        </w:tc>
+        <w:tc>
+          <w:tcPr>
+            <w:tcW w:type="dxa" w:w="960"/>
+          </w:tcPr>
+          <w:p>
+            <w:r>
+              <w:rPr>
+                <w:rFonts w:ascii="Consolas" w:hAnsi="Consolas"/>
+                <w:color w:val="C03030"/>
+              </w:rPr>
               <w:t>EV4d4015e6dbb4</w:t>
             </w:r>
           </w:p>
         </w:tc>
         <w:tc>
           <w:tcPr>
-            <w:tcW w:type="dxa" w:w="1080"/>
+            <w:tcW w:type="dxa" w:w="960"/>
           </w:tcPr>
           <w:p>
             <w:r>
@@ -2938,7 +3492,7 @@
         </w:tc>
         <w:tc>
           <w:tcPr>
-            <w:tcW w:type="dxa" w:w="1080"/>
+            <w:tcW w:type="dxa" w:w="960"/>
           </w:tcPr>
           <w:p>
             <w:r>
@@ -2948,7 +3502,7 @@
         </w:tc>
         <w:tc>
           <w:tcPr>
-            <w:tcW w:type="dxa" w:w="1080"/>
+            <w:tcW w:type="dxa" w:w="960"/>
           </w:tcPr>
           <w:p>
             <w:r>
@@ -2960,7 +3514,7 @@
       <w:tr>
         <w:tc>
           <w:tcPr>
-            <w:tcW w:type="dxa" w:w="1080"/>
+            <w:tcW w:type="dxa" w:w="960"/>
           </w:tcPr>
           <w:p>
             <w:r>
@@ -2970,7 +3524,7 @@
         </w:tc>
         <w:tc>
           <w:tcPr>
-            <w:tcW w:type="dxa" w:w="1080"/>
+            <w:tcW w:type="dxa" w:w="960"/>
           </w:tcPr>
           <w:p>
             <w:r>
@@ -2980,7 +3534,7 @@
         </w:tc>
         <w:tc>
           <w:tcPr>
-            <w:tcW w:type="dxa" w:w="1080"/>
+            <w:tcW w:type="dxa" w:w="960"/>
           </w:tcPr>
           <w:p>
             <w:r>
@@ -2990,7 +3544,7 @@
         </w:tc>
         <w:tc>
           <w:tcPr>
-            <w:tcW w:type="dxa" w:w="1080"/>
+            <w:tcW w:type="dxa" w:w="960"/>
           </w:tcPr>
           <w:p>
             <w:r>
@@ -3000,17 +3554,31 @@
         </w:tc>
         <w:tc>
           <w:tcPr>
-            <w:tcW w:type="dxa" w:w="1080"/>
-          </w:tcPr>
-          <w:p>
-            <w:r>
+            <w:tcW w:type="dxa" w:w="960"/>
+          </w:tcPr>
+          <w:p>
+            <w:r>
+              <w:t>Meta-reconocimiento en scroll</w:t>
+            </w:r>
+          </w:p>
+        </w:tc>
+        <w:tc>
+          <w:tcPr>
+            <w:tcW w:type="dxa" w:w="960"/>
+          </w:tcPr>
+          <w:p>
+            <w:r>
+              <w:rPr>
+                <w:rFonts w:ascii="Consolas" w:hAnsi="Consolas"/>
+                <w:color w:val="C03030"/>
+              </w:rPr>
               <w:t>EV5d9200bf439f</w:t>
             </w:r>
           </w:p>
         </w:tc>
         <w:tc>
           <w:tcPr>
-            <w:tcW w:type="dxa" w:w="1080"/>
+            <w:tcW w:type="dxa" w:w="960"/>
           </w:tcPr>
           <w:p>
             <w:r>
@@ -3020,7 +3588,7 @@
         </w:tc>
         <w:tc>
           <w:tcPr>
-            <w:tcW w:type="dxa" w:w="1080"/>
+            <w:tcW w:type="dxa" w:w="960"/>
           </w:tcPr>
           <w:p>
             <w:r>
@@ -3030,7 +3598,7 @@
         </w:tc>
         <w:tc>
           <w:tcPr>
-            <w:tcW w:type="dxa" w:w="1080"/>
+            <w:tcW w:type="dxa" w:w="960"/>
           </w:tcPr>
           <w:p>
             <w:r>
@@ -3042,7 +3610,7 @@
       <w:tr>
         <w:tc>
           <w:tcPr>
-            <w:tcW w:type="dxa" w:w="1080"/>
+            <w:tcW w:type="dxa" w:w="960"/>
           </w:tcPr>
           <w:p>
             <w:r>
@@ -3052,7 +3620,7 @@
         </w:tc>
         <w:tc>
           <w:tcPr>
-            <w:tcW w:type="dxa" w:w="1080"/>
+            <w:tcW w:type="dxa" w:w="960"/>
           </w:tcPr>
           <w:p>
             <w:r>
@@ -3062,7 +3630,7 @@
         </w:tc>
         <w:tc>
           <w:tcPr>
-            <w:tcW w:type="dxa" w:w="1080"/>
+            <w:tcW w:type="dxa" w:w="960"/>
           </w:tcPr>
           <w:p>
             <w:r>
@@ -3072,7 +3640,7 @@
         </w:tc>
         <w:tc>
           <w:tcPr>
-            <w:tcW w:type="dxa" w:w="1080"/>
+            <w:tcW w:type="dxa" w:w="960"/>
           </w:tcPr>
           <w:p>
             <w:r>
@@ -3082,17 +3650,31 @@
         </w:tc>
         <w:tc>
           <w:tcPr>
-            <w:tcW w:type="dxa" w:w="1080"/>
-          </w:tcPr>
-          <w:p>
-            <w:r>
+            <w:tcW w:type="dxa" w:w="960"/>
+          </w:tcPr>
+          <w:p>
+            <w:r>
+              <w:t>Gatillo alimentario / miedo a comer</w:t>
+            </w:r>
+          </w:p>
+        </w:tc>
+        <w:tc>
+          <w:tcPr>
+            <w:tcW w:type="dxa" w:w="960"/>
+          </w:tcPr>
+          <w:p>
+            <w:r>
+              <w:rPr>
+                <w:rFonts w:ascii="Consolas" w:hAnsi="Consolas"/>
+                <w:color w:val="C03030"/>
+              </w:rPr>
               <w:t>EV49bd7adae791</w:t>
             </w:r>
           </w:p>
         </w:tc>
         <w:tc>
           <w:tcPr>
-            <w:tcW w:type="dxa" w:w="1080"/>
+            <w:tcW w:type="dxa" w:w="960"/>
           </w:tcPr>
           <w:p>
             <w:r>
@@ -3102,7 +3684,7 @@
         </w:tc>
         <w:tc>
           <w:tcPr>
-            <w:tcW w:type="dxa" w:w="1080"/>
+            <w:tcW w:type="dxa" w:w="960"/>
           </w:tcPr>
           <w:p>
             <w:r>
@@ -3112,7 +3694,7 @@
         </w:tc>
         <w:tc>
           <w:tcPr>
-            <w:tcW w:type="dxa" w:w="1080"/>
+            <w:tcW w:type="dxa" w:w="960"/>
           </w:tcPr>
           <w:p>
             <w:r>
@@ -3124,7 +3706,7 @@
       <w:tr>
         <w:tc>
           <w:tcPr>
-            <w:tcW w:type="dxa" w:w="1080"/>
+            <w:tcW w:type="dxa" w:w="960"/>
           </w:tcPr>
           <w:p>
             <w:r>
@@ -3134,7 +3716,7 @@
         </w:tc>
         <w:tc>
           <w:tcPr>
-            <w:tcW w:type="dxa" w:w="1080"/>
+            <w:tcW w:type="dxa" w:w="960"/>
           </w:tcPr>
           <w:p>
             <w:r>
@@ -3144,7 +3726,7 @@
         </w:tc>
         <w:tc>
           <w:tcPr>
-            <w:tcW w:type="dxa" w:w="1080"/>
+            <w:tcW w:type="dxa" w:w="960"/>
           </w:tcPr>
           <w:p>
             <w:r>
@@ -3154,7 +3736,7 @@
         </w:tc>
         <w:tc>
           <w:tcPr>
-            <w:tcW w:type="dxa" w:w="1080"/>
+            <w:tcW w:type="dxa" w:w="960"/>
           </w:tcPr>
           <w:p>
             <w:r>
@@ -3164,17 +3746,31 @@
         </w:tc>
         <w:tc>
           <w:tcPr>
-            <w:tcW w:type="dxa" w:w="1080"/>
-          </w:tcPr>
-          <w:p>
-            <w:r>
+            <w:tcW w:type="dxa" w:w="960"/>
+          </w:tcPr>
+          <w:p>
+            <w:r>
+              <w:t>Invalidación 'es normal'</w:t>
+            </w:r>
+          </w:p>
+        </w:tc>
+        <w:tc>
+          <w:tcPr>
+            <w:tcW w:type="dxa" w:w="960"/>
+          </w:tcPr>
+          <w:p>
+            <w:r>
+              <w:rPr>
+                <w:rFonts w:ascii="Consolas" w:hAnsi="Consolas"/>
+                <w:color w:val="C03030"/>
+              </w:rPr>
               <w:t>EVef40d03a8002</w:t>
             </w:r>
           </w:p>
         </w:tc>
         <w:tc>
           <w:tcPr>
-            <w:tcW w:type="dxa" w:w="1080"/>
+            <w:tcW w:type="dxa" w:w="960"/>
           </w:tcPr>
           <w:p>
             <w:r>
@@ -3184,7 +3780,7 @@
         </w:tc>
         <w:tc>
           <w:tcPr>
-            <w:tcW w:type="dxa" w:w="1080"/>
+            <w:tcW w:type="dxa" w:w="960"/>
           </w:tcPr>
           <w:p>
             <w:r>
@@ -3194,7 +3790,7 @@
         </w:tc>
         <w:tc>
           <w:tcPr>
-            <w:tcW w:type="dxa" w:w="1080"/>
+            <w:tcW w:type="dxa" w:w="960"/>
           </w:tcPr>
           <w:p>
             <w:r>
@@ -3206,7 +3802,7 @@
       <w:tr>
         <w:tc>
           <w:tcPr>
-            <w:tcW w:type="dxa" w:w="1080"/>
+            <w:tcW w:type="dxa" w:w="960"/>
           </w:tcPr>
           <w:p>
             <w:r>
@@ -3216,7 +3812,7 @@
         </w:tc>
         <w:tc>
           <w:tcPr>
-            <w:tcW w:type="dxa" w:w="1080"/>
+            <w:tcW w:type="dxa" w:w="960"/>
           </w:tcPr>
           <w:p>
             <w:r>
@@ -3226,7 +3822,7 @@
         </w:tc>
         <w:tc>
           <w:tcPr>
-            <w:tcW w:type="dxa" w:w="1080"/>
+            <w:tcW w:type="dxa" w:w="960"/>
           </w:tcPr>
           <w:p>
             <w:r>
@@ -3236,7 +3832,7 @@
         </w:tc>
         <w:tc>
           <w:tcPr>
-            <w:tcW w:type="dxa" w:w="1080"/>
+            <w:tcW w:type="dxa" w:w="960"/>
           </w:tcPr>
           <w:p>
             <w:r>
@@ -3246,17 +3842,31 @@
         </w:tc>
         <w:tc>
           <w:tcPr>
-            <w:tcW w:type="dxa" w:w="1080"/>
-          </w:tcPr>
-          <w:p>
-            <w:r>
+            <w:tcW w:type="dxa" w:w="960"/>
+          </w:tcPr>
+          <w:p>
+            <w:r>
+              <w:t>Cronicidad / fatiga de soluciones</w:t>
+            </w:r>
+          </w:p>
+        </w:tc>
+        <w:tc>
+          <w:tcPr>
+            <w:tcW w:type="dxa" w:w="960"/>
+          </w:tcPr>
+          <w:p>
+            <w:r>
+              <w:rPr>
+                <w:rFonts w:ascii="Consolas" w:hAnsi="Consolas"/>
+                <w:color w:val="C03030"/>
+              </w:rPr>
               <w:t>EV584c0fd179b4</w:t>
             </w:r>
           </w:p>
         </w:tc>
         <w:tc>
           <w:tcPr>
-            <w:tcW w:type="dxa" w:w="1080"/>
+            <w:tcW w:type="dxa" w:w="960"/>
           </w:tcPr>
           <w:p>
             <w:r>
@@ -3266,7 +3876,7 @@
         </w:tc>
         <w:tc>
           <w:tcPr>
-            <w:tcW w:type="dxa" w:w="1080"/>
+            <w:tcW w:type="dxa" w:w="960"/>
           </w:tcPr>
           <w:p>
             <w:r>
@@ -3276,7 +3886,7 @@
         </w:tc>
         <w:tc>
           <w:tcPr>
-            <w:tcW w:type="dxa" w:w="1080"/>
+            <w:tcW w:type="dxa" w:w="960"/>
           </w:tcPr>
           <w:p>
             <w:r>
@@ -3288,7 +3898,7 @@
       <w:tr>
         <w:tc>
           <w:tcPr>
-            <w:tcW w:type="dxa" w:w="1080"/>
+            <w:tcW w:type="dxa" w:w="960"/>
           </w:tcPr>
           <w:p>
             <w:r>
@@ -3298,7 +3908,7 @@
         </w:tc>
         <w:tc>
           <w:tcPr>
-            <w:tcW w:type="dxa" w:w="1080"/>
+            <w:tcW w:type="dxa" w:w="960"/>
           </w:tcPr>
           <w:p>
             <w:r>
@@ -3308,7 +3918,7 @@
         </w:tc>
         <w:tc>
           <w:tcPr>
-            <w:tcW w:type="dxa" w:w="1080"/>
+            <w:tcW w:type="dxa" w:w="960"/>
           </w:tcPr>
           <w:p>
             <w:r>
@@ -3318,7 +3928,7 @@
         </w:tc>
         <w:tc>
           <w:tcPr>
-            <w:tcW w:type="dxa" w:w="1080"/>
+            <w:tcW w:type="dxa" w:w="960"/>
           </w:tcPr>
           <w:p>
             <w:r>
@@ -3328,17 +3938,31 @@
         </w:tc>
         <w:tc>
           <w:tcPr>
-            <w:tcW w:type="dxa" w:w="1080"/>
-          </w:tcPr>
-          <w:p>
-            <w:r>
+            <w:tcW w:type="dxa" w:w="960"/>
+          </w:tcPr>
+          <w:p>
+            <w:r>
+              <w:t>Puente hinchazón→hígado como testimonio</w:t>
+            </w:r>
+          </w:p>
+        </w:tc>
+        <w:tc>
+          <w:tcPr>
+            <w:tcW w:type="dxa" w:w="960"/>
+          </w:tcPr>
+          <w:p>
+            <w:r>
+              <w:rPr>
+                <w:rFonts w:ascii="Consolas" w:hAnsi="Consolas"/>
+                <w:color w:val="C03030"/>
+              </w:rPr>
               <w:t>EVec2e8ff832dc</w:t>
             </w:r>
           </w:p>
         </w:tc>
         <w:tc>
           <w:tcPr>
-            <w:tcW w:type="dxa" w:w="1080"/>
+            <w:tcW w:type="dxa" w:w="960"/>
           </w:tcPr>
           <w:p>
             <w:r>
@@ -3348,7 +3972,7 @@
         </w:tc>
         <w:tc>
           <w:tcPr>
-            <w:tcW w:type="dxa" w:w="1080"/>
+            <w:tcW w:type="dxa" w:w="960"/>
           </w:tcPr>
           <w:p>
             <w:r>
@@ -3358,7 +3982,7 @@
         </w:tc>
         <w:tc>
           <w:tcPr>
-            <w:tcW w:type="dxa" w:w="1080"/>
+            <w:tcW w:type="dxa" w:w="960"/>
           </w:tcPr>
           <w:p>
             <w:r>
@@ -3744,7 +4368,7 @@
     <w:rsid w:val="00FC693F"/>
     <w:rPr>
       <w:rFonts w:ascii="Calibri" w:hAnsi="Calibri"/>
-      <w:sz w:val="20"/>
+      <w:sz w:val="22"/>
     </w:rPr>
   </w:style>
   <w:style w:type="paragraph" w:styleId="Header">

</xml_diff>